<commit_message>
Audit IEEE and APA manuscript formatting
</commit_message>
<xml_diff>
--- a/paper/Sampling_Sigma_APA7_Scholarly_Revised_Research_Paper.docx
+++ b/paper/Sampling_Sigma_APA7_Scholarly_Revised_Research_Paper.docx
@@ -8,7 +8,7 @@
     <w:p>
       <w:pPr>
         <w:keepNext/>
-        <w:spacing w:line="480" w:lineRule="auto" w:after="140" w:before="0"/>
+        <w:spacing w:line="480" w:lineRule="auto" w:after="0" w:before="0"/>
         <w:jc w:val="center"/>
       </w:pPr>
       <w:r>
@@ -21,7 +21,7 @@
     </w:p>
     <w:p>
       <w:pPr>
-        <w:spacing w:line="480" w:lineRule="auto" w:after="140" w:before="0"/>
+        <w:spacing w:line="480" w:lineRule="auto" w:after="0" w:before="0"/>
         <w:jc w:val="center"/>
       </w:pPr>
       <w:r>
@@ -34,7 +34,7 @@
     </w:p>
     <w:p>
       <w:pPr>
-        <w:spacing w:line="480" w:lineRule="auto" w:after="140" w:before="0"/>
+        <w:spacing w:line="480" w:lineRule="auto" w:after="0" w:before="0"/>
         <w:jc w:val="center"/>
       </w:pPr>
       <w:r>
@@ -47,7 +47,7 @@
     </w:p>
     <w:p>
       <w:pPr>
-        <w:spacing w:line="480" w:lineRule="auto" w:after="140" w:before="0"/>
+        <w:spacing w:line="480" w:lineRule="auto" w:after="0" w:before="0"/>
         <w:jc w:val="center"/>
       </w:pPr>
       <w:r>
@@ -62,7 +62,7 @@
     <w:p>
       <w:pPr>
         <w:keepNext/>
-        <w:spacing w:line="480" w:lineRule="auto" w:before="360" w:after="160"/>
+        <w:spacing w:line="480" w:lineRule="auto" w:before="0" w:after="0"/>
         <w:jc w:val="center"/>
       </w:pPr>
       <w:r>
@@ -74,7 +74,7 @@
     </w:p>
     <w:p>
       <w:pPr>
-        <w:spacing w:line="480" w:lineRule="auto" w:after="140" w:before="0"/>
+        <w:spacing w:line="480" w:lineRule="auto" w:after="0" w:before="0"/>
       </w:pPr>
       <w:r>
         <w:rPr>
@@ -86,7 +86,7 @@
     </w:p>
     <w:p>
       <w:pPr>
-        <w:spacing w:line="480" w:lineRule="auto" w:after="140" w:before="0"/>
+        <w:spacing w:line="480" w:lineRule="auto" w:after="0" w:before="0"/>
       </w:pPr>
       <w:r>
         <w:rPr>
@@ -98,7 +98,7 @@
     </w:p>
     <w:p>
       <w:pPr>
-        <w:spacing w:line="480" w:lineRule="auto" w:after="140" w:before="0"/>
+        <w:spacing w:line="480" w:lineRule="auto" w:after="0" w:before="0"/>
       </w:pPr>
       <w:r>
         <w:rPr>
@@ -110,14 +110,14 @@
     </w:p>
     <w:p>
       <w:pPr>
-        <w:spacing w:line="480" w:lineRule="auto" w:after="140" w:before="0"/>
+        <w:spacing w:line="480" w:lineRule="auto" w:after="0" w:before="0"/>
       </w:pPr>
       <w:r>
         <w:rPr>
           <w:b w:val="0"/>
           <w:i w:val="0"/>
         </w:rPr>
-        <w:t>Correspondence concerning this article should be addressed to Sri Sai Lakshmi Ganesh Murukutla, Murukutla Group LLC, Austin, TX, USA. Contact: https://murukutlagroup.com/contact</w:t>
+        <w:t>Correspondence concerning this article should be addressed to Sri Sai Lakshmi Ganesh Murukutla, Murukutla Group LLC, Austin, TX, USA. Email: murukutlassl@gmail.com</w:t>
       </w:r>
     </w:p>
     <w:p>
@@ -128,7 +128,7 @@
     <w:p>
       <w:pPr>
         <w:keepNext/>
-        <w:spacing w:line="480" w:lineRule="auto" w:before="360" w:after="160"/>
+        <w:spacing w:line="480" w:lineRule="auto" w:before="0" w:after="0"/>
         <w:jc w:val="center"/>
       </w:pPr>
       <w:r>
@@ -140,7 +140,7 @@
     </w:p>
     <w:p>
       <w:pPr>
-        <w:spacing w:line="480" w:lineRule="auto" w:after="140" w:before="0"/>
+        <w:spacing w:line="480" w:lineRule="auto" w:after="0" w:before="0"/>
       </w:pPr>
       <w:r>
         <w:rPr>
@@ -152,7 +152,7 @@
     </w:p>
     <w:p>
       <w:pPr>
-        <w:spacing w:line="480" w:lineRule="auto" w:after="140" w:before="0"/>
+        <w:spacing w:line="480" w:lineRule="auto" w:after="0" w:before="0"/>
       </w:pPr>
       <w:r>
         <w:rPr>
@@ -178,7 +178,7 @@
     <w:p>
       <w:pPr>
         <w:keepNext/>
-        <w:spacing w:line="480" w:lineRule="auto" w:before="360" w:after="160"/>
+        <w:spacing w:line="480" w:lineRule="auto" w:before="0" w:after="0"/>
         <w:jc w:val="center"/>
       </w:pPr>
       <w:r>
@@ -190,20 +190,7 @@
     </w:p>
     <w:p>
       <w:pPr>
-        <w:keepNext/>
-        <w:spacing w:line="480" w:lineRule="auto" w:before="360" w:after="160"/>
-        <w:jc w:val="center"/>
-      </w:pPr>
-      <w:r>
-        <w:rPr>
-          <w:b/>
-        </w:rPr>
-        <w:t>Introduction</w:t>
-      </w:r>
-    </w:p>
-    <w:p>
-      <w:pPr>
-        <w:spacing w:line="480" w:lineRule="auto" w:after="140" w:before="0"/>
+        <w:spacing w:line="480" w:lineRule="auto" w:after="0" w:before="0"/>
         <w:ind w:firstLine="720"/>
       </w:pPr>
       <w:r>
@@ -216,7 +203,7 @@
     </w:p>
     <w:p>
       <w:pPr>
-        <w:spacing w:line="480" w:lineRule="auto" w:after="140" w:before="0"/>
+        <w:spacing w:line="480" w:lineRule="auto" w:after="0" w:before="0"/>
         <w:ind w:firstLine="720"/>
       </w:pPr>
       <w:r>
@@ -229,7 +216,7 @@
     </w:p>
     <w:p>
       <w:pPr>
-        <w:spacing w:line="480" w:lineRule="auto" w:after="140" w:before="0"/>
+        <w:spacing w:line="480" w:lineRule="auto" w:after="0" w:before="0"/>
         <w:ind w:firstLine="720"/>
       </w:pPr>
       <w:r>
@@ -243,7 +230,7 @@
     <w:p>
       <w:pPr>
         <w:keepNext/>
-        <w:spacing w:line="480" w:lineRule="auto" w:before="360" w:after="160"/>
+        <w:spacing w:line="480" w:lineRule="auto" w:before="0" w:after="0"/>
         <w:jc w:val="center"/>
       </w:pPr>
       <w:r>
@@ -256,7 +243,7 @@
     <w:p>
       <w:pPr>
         <w:keepNext/>
-        <w:spacing w:line="480" w:lineRule="auto" w:before="280" w:after="120"/>
+        <w:spacing w:line="480" w:lineRule="auto" w:before="0" w:after="0"/>
         <w:jc w:val="left"/>
       </w:pPr>
       <w:r>
@@ -268,7 +255,7 @@
     </w:p>
     <w:p>
       <w:pPr>
-        <w:spacing w:line="480" w:lineRule="auto" w:after="120"/>
+        <w:spacing w:line="480" w:lineRule="auto" w:after="0"/>
         <w:ind w:left="720" w:hanging="360"/>
       </w:pPr>
       <w:r>
@@ -279,7 +266,7 @@
     </w:p>
     <w:p>
       <w:pPr>
-        <w:spacing w:line="480" w:lineRule="auto" w:after="120"/>
+        <w:spacing w:line="480" w:lineRule="auto" w:after="0"/>
         <w:ind w:left="720" w:hanging="360"/>
       </w:pPr>
       <w:r>
@@ -290,7 +277,7 @@
     </w:p>
     <w:p>
       <w:pPr>
-        <w:spacing w:line="480" w:lineRule="auto" w:after="120"/>
+        <w:spacing w:line="480" w:lineRule="auto" w:after="0"/>
         <w:ind w:left="720" w:hanging="360"/>
       </w:pPr>
       <w:r>
@@ -301,7 +288,7 @@
     </w:p>
     <w:p>
       <w:pPr>
-        <w:spacing w:line="480" w:lineRule="auto" w:after="120"/>
+        <w:spacing w:line="480" w:lineRule="auto" w:after="0"/>
         <w:ind w:left="720" w:hanging="360"/>
       </w:pPr>
       <w:r>
@@ -312,7 +299,7 @@
     </w:p>
     <w:p>
       <w:pPr>
-        <w:spacing w:line="480" w:lineRule="auto" w:after="120"/>
+        <w:spacing w:line="480" w:lineRule="auto" w:after="0"/>
         <w:ind w:left="720" w:hanging="360"/>
       </w:pPr>
       <w:r>
@@ -324,7 +311,7 @@
     <w:p>
       <w:pPr>
         <w:keepNext/>
-        <w:spacing w:line="480" w:lineRule="auto" w:before="280" w:after="120"/>
+        <w:spacing w:line="480" w:lineRule="auto" w:before="0" w:after="0"/>
         <w:jc w:val="left"/>
       </w:pPr>
       <w:r>
@@ -336,7 +323,7 @@
     </w:p>
     <w:p>
       <w:pPr>
-        <w:spacing w:line="480" w:lineRule="auto" w:after="140" w:before="0"/>
+        <w:spacing w:line="480" w:lineRule="auto" w:after="0" w:before="0"/>
         <w:ind w:firstLine="720"/>
       </w:pPr>
       <w:r>
@@ -350,7 +337,7 @@
     <w:p>
       <w:pPr>
         <w:keepNext/>
-        <w:spacing w:line="480" w:lineRule="auto" w:before="360" w:after="160"/>
+        <w:spacing w:line="480" w:lineRule="auto" w:before="0" w:after="0"/>
         <w:jc w:val="center"/>
       </w:pPr>
       <w:r>
@@ -362,7 +349,7 @@
     </w:p>
     <w:p>
       <w:pPr>
-        <w:spacing w:line="480" w:lineRule="auto" w:after="140" w:before="0"/>
+        <w:spacing w:line="480" w:lineRule="auto" w:after="0" w:before="0"/>
         <w:ind w:firstLine="720"/>
       </w:pPr>
       <w:r>
@@ -370,13 +357,13 @@
           <w:b w:val="0"/>
           <w:i w:val="0"/>
         </w:rPr>
-        <w:t>The study follows the design science cycle described by Hevner et al. (2004), progressing from problem identification and requirements derivation through construction, demonstration, evaluation, and communication. Requirements were synthesized from guidance on assessment, secure development, provenance, credentials, and threat modeling (W3C, 2025; NIST, 2022a; SLSA, n.d.; C2PA, n.d.; NIST, 2022b). Evaluation proceeds in three stages: deterministic contract tests, controlled mutation and reference state-machine experiments, and a planned comparative human study. Measured results are currently available for the first two stages only.</w:t>
+        <w:t>The study follows the design science cycle described by Hevner et al. (2004), progressing from problem identification and requirements derivation through construction, demonstration, evaluation, and communication. Requirements were synthesized from guidance on assessment, secure development, provenance, credentials, and threat modeling (W3C, 2025; NIST, 2022a; SLSA, n.d.; C2PA, n.d.; NIST, 2022b). Evaluation proceeds in three stages: deterministic contract tests, controlled mutation and reference state-machine experiments, and a planned comparative human study. Measured results are currently available for the first two stages only. Table 1 summarizes the resulting requirements and protected failure modes.</w:t>
       </w:r>
     </w:p>
     <w:p>
       <w:pPr>
         <w:keepNext/>
-        <w:spacing w:line="480" w:lineRule="auto" w:before="240" w:after="0"/>
+        <w:spacing w:line="480" w:lineRule="auto" w:before="0" w:after="0"/>
       </w:pPr>
       <w:r>
         <w:rPr>
@@ -388,7 +375,7 @@
     <w:p>
       <w:pPr>
         <w:keepNext/>
-        <w:spacing w:line="480" w:lineRule="auto" w:after="120"/>
+        <w:spacing w:line="480" w:lineRule="auto" w:after="0"/>
       </w:pPr>
       <w:r>
         <w:rPr>
@@ -437,7 +424,7 @@
               <w:rPr>
                 <w:rFonts w:ascii="Times New Roman" w:hAnsi="Times New Roman"/>
                 <w:b/>
-                <w:sz w:val="20"/>
+                <w:sz w:val="24"/>
               </w:rPr>
               <w:t>ID</w:t>
             </w:r>
@@ -470,7 +457,7 @@
               <w:rPr>
                 <w:rFonts w:ascii="Times New Roman" w:hAnsi="Times New Roman"/>
                 <w:b/>
-                <w:sz w:val="20"/>
+                <w:sz w:val="24"/>
               </w:rPr>
               <w:t>Requirement</w:t>
             </w:r>
@@ -503,7 +490,7 @@
               <w:rPr>
                 <w:rFonts w:ascii="Times New Roman" w:hAnsi="Times New Roman"/>
                 <w:b/>
-                <w:sz w:val="20"/>
+                <w:sz w:val="24"/>
               </w:rPr>
               <w:t>Failure</w:t>
             </w:r>
@@ -536,7 +523,7 @@
               <w:rPr>
                 <w:rFonts w:ascii="Times New Roman" w:hAnsi="Times New Roman"/>
                 <w:b w:val="0"/>
-                <w:sz w:val="20"/>
+                <w:sz w:val="24"/>
               </w:rPr>
               <w:t>R1</w:t>
             </w:r>
@@ -567,7 +554,7 @@
               <w:rPr>
                 <w:rFonts w:ascii="Times New Roman" w:hAnsi="Times New Roman"/>
                 <w:b w:val="0"/>
-                <w:sz w:val="20"/>
+                <w:sz w:val="24"/>
               </w:rPr>
               <w:t>Bind artifact, subject, scope, limitations, and period</w:t>
             </w:r>
@@ -598,7 +585,7 @@
               <w:rPr>
                 <w:rFonts w:ascii="Times New Roman" w:hAnsi="Times New Roman"/>
                 <w:b w:val="0"/>
-                <w:sz w:val="20"/>
+                <w:sz w:val="24"/>
               </w:rPr>
               <w:t>Context collapse</w:t>
             </w:r>
@@ -631,7 +618,7 @@
               <w:rPr>
                 <w:rFonts w:ascii="Times New Roman" w:hAnsi="Times New Roman"/>
                 <w:b w:val="0"/>
-                <w:sz w:val="20"/>
+                <w:sz w:val="24"/>
               </w:rPr>
               <w:t>R2</w:t>
             </w:r>
@@ -662,7 +649,7 @@
               <w:rPr>
                 <w:rFonts w:ascii="Times New Roman" w:hAnsi="Times New Roman"/>
                 <w:b w:val="0"/>
-                <w:sz w:val="20"/>
+                <w:sz w:val="24"/>
               </w:rPr>
               <w:t>Separate issuer and reviewer organization</w:t>
             </w:r>
@@ -693,7 +680,7 @@
               <w:rPr>
                 <w:rFonts w:ascii="Times New Roman" w:hAnsi="Times New Roman"/>
                 <w:b w:val="0"/>
-                <w:sz w:val="20"/>
+                <w:sz w:val="24"/>
               </w:rPr>
               <w:t>Self-approval</w:t>
             </w:r>
@@ -726,7 +713,7 @@
               <w:rPr>
                 <w:rFonts w:ascii="Times New Roman" w:hAnsi="Times New Roman"/>
                 <w:b w:val="0"/>
-                <w:sz w:val="20"/>
+                <w:sz w:val="24"/>
               </w:rPr>
               <w:t>R3</w:t>
             </w:r>
@@ -757,7 +744,7 @@
               <w:rPr>
                 <w:rFonts w:ascii="Times New Roman" w:hAnsi="Times New Roman"/>
                 <w:b w:val="0"/>
-                <w:sz w:val="20"/>
+                <w:sz w:val="24"/>
               </w:rPr>
               <w:t>Commit conflicts and review evidence</w:t>
             </w:r>
@@ -788,7 +775,7 @@
               <w:rPr>
                 <w:rFonts w:ascii="Times New Roman" w:hAnsi="Times New Roman"/>
                 <w:b w:val="0"/>
-                <w:sz w:val="20"/>
+                <w:sz w:val="24"/>
               </w:rPr>
               <w:t>Hidden dependency</w:t>
             </w:r>
@@ -821,7 +808,7 @@
               <w:rPr>
                 <w:rFonts w:ascii="Times New Roman" w:hAnsi="Times New Roman"/>
                 <w:b w:val="0"/>
-                <w:sz w:val="20"/>
+                <w:sz w:val="24"/>
               </w:rPr>
               <w:t>R4</w:t>
             </w:r>
@@ -852,7 +839,7 @@
               <w:rPr>
                 <w:rFonts w:ascii="Times New Roman" w:hAnsi="Times New Roman"/>
                 <w:b w:val="0"/>
-                <w:sz w:val="20"/>
+                <w:sz w:val="24"/>
               </w:rPr>
               <w:t>Expose validity, rejection, revocation, supersession</w:t>
             </w:r>
@@ -883,7 +870,7 @@
               <w:rPr>
                 <w:rFonts w:ascii="Times New Roman" w:hAnsi="Times New Roman"/>
                 <w:b w:val="0"/>
-                <w:sz w:val="20"/>
+                <w:sz w:val="24"/>
               </w:rPr>
               <w:t>Stale assurance</w:t>
             </w:r>
@@ -916,7 +903,7 @@
               <w:rPr>
                 <w:rFonts w:ascii="Times New Roman" w:hAnsi="Times New Roman"/>
                 <w:b w:val="0"/>
-                <w:sz w:val="20"/>
+                <w:sz w:val="24"/>
               </w:rPr>
               <w:t>R5</w:t>
             </w:r>
@@ -947,7 +934,7 @@
               <w:rPr>
                 <w:rFonts w:ascii="Times New Roman" w:hAnsi="Times New Roman"/>
                 <w:b w:val="0"/>
-                <w:sz w:val="20"/>
+                <w:sz w:val="24"/>
               </w:rPr>
               <w:t>Keep evidence off-chain; verify locally</w:t>
             </w:r>
@@ -978,7 +965,7 @@
               <w:rPr>
                 <w:rFonts w:ascii="Times New Roman" w:hAnsi="Times New Roman"/>
                 <w:b w:val="0"/>
-                <w:sz w:val="20"/>
+                <w:sz w:val="24"/>
               </w:rPr>
               <w:t>Disclosure</w:t>
             </w:r>
@@ -1012,7 +999,7 @@
               <w:rPr>
                 <w:rFonts w:ascii="Times New Roman" w:hAnsi="Times New Roman"/>
                 <w:b w:val="0"/>
-                <w:sz w:val="20"/>
+                <w:sz w:val="24"/>
               </w:rPr>
               <w:t>R6</w:t>
             </w:r>
@@ -1044,7 +1031,7 @@
               <w:rPr>
                 <w:rFonts w:ascii="Times New Roman" w:hAnsi="Times New Roman"/>
                 <w:b w:val="0"/>
-                <w:sz w:val="20"/>
+                <w:sz w:val="24"/>
               </w:rPr>
               <w:t>Separate validity from token economics</w:t>
             </w:r>
@@ -1076,7 +1063,7 @@
               <w:rPr>
                 <w:rFonts w:ascii="Times New Roman" w:hAnsi="Times New Roman"/>
                 <w:b w:val="0"/>
-                <w:sz w:val="20"/>
+                <w:sz w:val="24"/>
               </w:rPr>
               <w:t>Economic capture</w:t>
             </w:r>
@@ -1086,13 +1073,8 @@
     </w:tbl>
     <w:p>
       <w:pPr>
-        <w:spacing w:line="240" w:lineRule="auto" w:after="120"/>
-      </w:pPr>
-    </w:p>
-    <w:p>
-      <w:pPr>
         <w:keepNext/>
-        <w:spacing w:line="480" w:lineRule="auto" w:before="360" w:after="160"/>
+        <w:spacing w:line="480" w:lineRule="auto" w:before="0" w:after="0"/>
         <w:jc w:val="center"/>
       </w:pPr>
       <w:r>
@@ -1105,7 +1087,7 @@
     <w:p>
       <w:pPr>
         <w:keepNext/>
-        <w:spacing w:line="480" w:lineRule="auto" w:before="280" w:after="120"/>
+        <w:spacing w:line="480" w:lineRule="auto" w:before="0" w:after="0"/>
         <w:jc w:val="left"/>
       </w:pPr>
       <w:r>
@@ -1117,7 +1099,7 @@
     </w:p>
     <w:p>
       <w:pPr>
-        <w:spacing w:line="480" w:lineRule="auto" w:after="140" w:before="0"/>
+        <w:spacing w:line="480" w:lineRule="auto" w:after="0" w:before="0"/>
         <w:ind w:firstLine="720"/>
       </w:pPr>
       <w:r>
@@ -1125,13 +1107,13 @@
           <w:b w:val="0"/>
           <w:i w:val="0"/>
         </w:rPr>
-        <w:t>The architecture distributes responsibility across five assurance planes and an optional economic plane. Source artifacts remain in an encrypted evidence vault. The passport service canonicalizes, hashes, validates, and signs the portable record, while an independence graph represents organizations and disclosed relationships. An assurance registry stores minimum commitments and lifecycle events. At the point of use, the local verifier recalculates the digest, validates the signature and status, checks validity and supersession, and applies the relying party's policy. The optional economic layer is structurally excluded from decisions about evidentiary truth.</w:t>
+        <w:t>The architecture distributes responsibility across five assurance planes and an optional economic plane. Source artifacts remain in an encrypted evidence vault. The passport service canonicalizes, hashes, validates, and signs the portable record, while an independence graph represents organizations and disclosed relationships. An assurance registry stores minimum commitments and lifecycle events. At the point of use, the local verifier recalculates the digest, validates the signature and status, checks validity and supersession, and applies the relying party's policy. The optional economic layer is structurally excluded from decisions about evidentiary truth. Table 2 groups the fields carried by the evidence passport.</w:t>
       </w:r>
     </w:p>
     <w:p>
       <w:pPr>
         <w:keepNext/>
-        <w:spacing w:line="480" w:lineRule="auto" w:before="240" w:after="0"/>
+        <w:spacing w:line="480" w:lineRule="auto" w:before="0" w:after="0"/>
       </w:pPr>
       <w:r>
         <w:rPr>
@@ -1143,7 +1125,7 @@
     <w:p>
       <w:pPr>
         <w:keepNext/>
-        <w:spacing w:line="480" w:lineRule="auto" w:after="120"/>
+        <w:spacing w:line="480" w:lineRule="auto" w:after="0"/>
       </w:pPr>
       <w:r>
         <w:rPr>
@@ -1191,7 +1173,7 @@
               <w:rPr>
                 <w:rFonts w:ascii="Times New Roman" w:hAnsi="Times New Roman"/>
                 <w:b/>
-                <w:sz w:val="20"/>
+                <w:sz w:val="24"/>
               </w:rPr>
               <w:t>Group</w:t>
             </w:r>
@@ -1224,7 +1206,7 @@
               <w:rPr>
                 <w:rFonts w:ascii="Times New Roman" w:hAnsi="Times New Roman"/>
                 <w:b/>
-                <w:sz w:val="20"/>
+                <w:sz w:val="24"/>
               </w:rPr>
               <w:t>Required fields</w:t>
             </w:r>
@@ -1257,7 +1239,7 @@
               <w:rPr>
                 <w:rFonts w:ascii="Times New Roman" w:hAnsi="Times New Roman"/>
                 <w:b w:val="0"/>
-                <w:sz w:val="20"/>
+                <w:sz w:val="24"/>
               </w:rPr>
               <w:t>Identity</w:t>
             </w:r>
@@ -1288,7 +1270,7 @@
               <w:rPr>
                 <w:rFonts w:ascii="Times New Roman" w:hAnsi="Times New Roman"/>
                 <w:b w:val="0"/>
-                <w:sz w:val="20"/>
+                <w:sz w:val="24"/>
               </w:rPr>
               <w:t>Schema version, passport ID, subject commitment</w:t>
             </w:r>
@@ -1321,7 +1303,7 @@
               <w:rPr>
                 <w:rFonts w:ascii="Times New Roman" w:hAnsi="Times New Roman"/>
                 <w:b w:val="0"/>
-                <w:sz w:val="20"/>
+                <w:sz w:val="24"/>
               </w:rPr>
               <w:t>Integrity</w:t>
             </w:r>
@@ -1352,7 +1334,7 @@
               <w:rPr>
                 <w:rFonts w:ascii="Times New Roman" w:hAnsi="Times New Roman"/>
                 <w:b w:val="0"/>
-                <w:sz w:val="20"/>
+                <w:sz w:val="24"/>
               </w:rPr>
               <w:t>Algorithm, artifact digest, canonicalization profile</w:t>
             </w:r>
@@ -1385,7 +1367,7 @@
               <w:rPr>
                 <w:rFonts w:ascii="Times New Roman" w:hAnsi="Times New Roman"/>
                 <w:b w:val="0"/>
-                <w:sz w:val="20"/>
+                <w:sz w:val="24"/>
               </w:rPr>
               <w:t>Context</w:t>
             </w:r>
@@ -1416,7 +1398,7 @@
               <w:rPr>
                 <w:rFonts w:ascii="Times New Roman" w:hAnsi="Times New Roman"/>
                 <w:b w:val="0"/>
-                <w:sz w:val="20"/>
+                <w:sz w:val="24"/>
               </w:rPr>
               <w:t>Domain, assessment type, scope and limitation commitments</w:t>
             </w:r>
@@ -1449,7 +1431,7 @@
               <w:rPr>
                 <w:rFonts w:ascii="Times New Roman" w:hAnsi="Times New Roman"/>
                 <w:b w:val="0"/>
-                <w:sz w:val="20"/>
+                <w:sz w:val="24"/>
               </w:rPr>
               <w:t>Review</w:t>
             </w:r>
@@ -1480,7 +1462,7 @@
               <w:rPr>
                 <w:rFonts w:ascii="Times New Roman" w:hAnsi="Times New Roman"/>
                 <w:b w:val="0"/>
-                <w:sz w:val="20"/>
+                <w:sz w:val="24"/>
               </w:rPr>
               <w:t>Issuer, reviewer organization, conflict and evidence commitments</w:t>
             </w:r>
@@ -1513,7 +1495,7 @@
               <w:rPr>
                 <w:rFonts w:ascii="Times New Roman" w:hAnsi="Times New Roman"/>
                 <w:b w:val="0"/>
-                <w:sz w:val="20"/>
+                <w:sz w:val="24"/>
               </w:rPr>
               <w:t>Lifecycle</w:t>
             </w:r>
@@ -1544,7 +1526,7 @@
               <w:rPr>
                 <w:rFonts w:ascii="Times New Roman" w:hAnsi="Times New Roman"/>
                 <w:b w:val="0"/>
-                <w:sz w:val="20"/>
+                <w:sz w:val="24"/>
               </w:rPr>
               <w:t>Issued time, valid-until, status, revocation, supersession</w:t>
             </w:r>
@@ -1578,7 +1560,7 @@
               <w:rPr>
                 <w:rFonts w:ascii="Times New Roman" w:hAnsi="Times New Roman"/>
                 <w:b w:val="0"/>
-                <w:sz w:val="20"/>
+                <w:sz w:val="24"/>
               </w:rPr>
               <w:t>Proof</w:t>
             </w:r>
@@ -1610,7 +1592,7 @@
               <w:rPr>
                 <w:rFonts w:ascii="Times New Roman" w:hAnsi="Times New Roman"/>
                 <w:b w:val="0"/>
-                <w:sz w:val="20"/>
+                <w:sz w:val="24"/>
               </w:rPr>
               <w:t>Signature suite, key identifier, policy and status endpoints</w:t>
             </w:r>
@@ -1620,12 +1602,7 @@
     </w:tbl>
     <w:p>
       <w:pPr>
-        <w:spacing w:line="240" w:lineRule="auto" w:after="120"/>
-      </w:pPr>
-    </w:p>
-    <w:p>
-      <w:pPr>
-        <w:spacing w:line="480" w:lineRule="auto" w:after="140" w:before="0"/>
+        <w:spacing w:line="480" w:lineRule="auto" w:after="0" w:before="0"/>
         <w:ind w:firstLine="720"/>
       </w:pPr>
       <w:r>
@@ -1639,7 +1616,7 @@
     <w:p>
       <w:pPr>
         <w:keepNext/>
-        <w:spacing w:line="480" w:lineRule="auto" w:before="280" w:after="120"/>
+        <w:spacing w:line="480" w:lineRule="auto" w:before="0" w:after="0"/>
         <w:jc w:val="left"/>
       </w:pPr>
       <w:r>
@@ -1651,7 +1628,7 @@
     </w:p>
     <w:p>
       <w:pPr>
-        <w:spacing w:line="480" w:lineRule="auto" w:after="140" w:before="0"/>
+        <w:spacing w:line="480" w:lineRule="auto" w:after="0" w:before="0"/>
         <w:ind w:firstLine="720"/>
       </w:pPr>
       <w:r>
@@ -1733,12 +1710,7 @@
     </w:tbl>
     <w:p>
       <w:pPr>
-        <w:spacing w:after="80" w:line="240" w:lineRule="auto"/>
-      </w:pPr>
-    </w:p>
-    <w:p>
-      <w:pPr>
-        <w:spacing w:line="480" w:lineRule="auto" w:after="140" w:before="0"/>
+        <w:spacing w:line="480" w:lineRule="auto" w:after="0" w:before="0"/>
         <w:ind w:firstLine="720"/>
       </w:pPr>
       <w:r>
@@ -1820,12 +1792,7 @@
     </w:tbl>
     <w:p>
       <w:pPr>
-        <w:spacing w:after="80" w:line="240" w:lineRule="auto"/>
-      </w:pPr>
-    </w:p>
-    <w:p>
-      <w:pPr>
-        <w:spacing w:line="480" w:lineRule="auto" w:after="140" w:before="0"/>
+        <w:spacing w:line="480" w:lineRule="auto" w:after="0" w:before="0"/>
         <w:ind w:firstLine="720"/>
       </w:pPr>
       <w:r>
@@ -1833,13 +1800,13 @@
           <w:b w:val="0"/>
           <w:i w:val="0"/>
         </w:rPr>
-        <w:t>H recomputes the artifact commitment; S validates the issuer proof; C requires the relying party to acknowledge scope and limitations; R checks reviewer identity, organizational separation, and conflict disclosure; T rejects expired, revoked, rejected, or superseded passports; and Q applies local policy. A zero in any term produces rejection. This model prevents confidence scores from overriding a failed mandatory control.</w:t>
+        <w:t>H recomputes the artifact commitment; S validates the issuer proof; C requires the relying party to acknowledge scope and limitations; R checks reviewer identity, organizational separation, and conflict disclosure; T rejects expired, revoked, rejected, or superseded passports; and Q applies local policy. A zero in any term produces rejection. This model prevents confidence scores from overriding a failed mandatory control. Table 3 summarizes the threats used to challenge these checks.</w:t>
       </w:r>
     </w:p>
     <w:p>
       <w:pPr>
         <w:keepNext/>
-        <w:spacing w:line="480" w:lineRule="auto" w:before="360" w:after="160"/>
+        <w:spacing w:line="480" w:lineRule="auto" w:before="0" w:after="0"/>
         <w:jc w:val="center"/>
       </w:pPr>
       <w:r>
@@ -1852,7 +1819,7 @@
     <w:p>
       <w:pPr>
         <w:keepNext/>
-        <w:spacing w:line="480" w:lineRule="auto" w:before="240" w:after="0"/>
+        <w:spacing w:line="480" w:lineRule="auto" w:before="0" w:after="0"/>
       </w:pPr>
       <w:r>
         <w:rPr>
@@ -1864,7 +1831,7 @@
     <w:p>
       <w:pPr>
         <w:keepNext/>
-        <w:spacing w:line="480" w:lineRule="auto" w:after="120"/>
+        <w:spacing w:line="480" w:lineRule="auto" w:after="0"/>
       </w:pPr>
       <w:r>
         <w:rPr>
@@ -1913,7 +1880,7 @@
               <w:rPr>
                 <w:rFonts w:ascii="Times New Roman" w:hAnsi="Times New Roman"/>
                 <w:b/>
-                <w:sz w:val="20"/>
+                <w:sz w:val="24"/>
               </w:rPr>
               <w:t>Threat</w:t>
             </w:r>
@@ -1946,7 +1913,7 @@
               <w:rPr>
                 <w:rFonts w:ascii="Times New Roman" w:hAnsi="Times New Roman"/>
                 <w:b/>
-                <w:sz w:val="20"/>
+                <w:sz w:val="24"/>
               </w:rPr>
               <w:t>Mitigation</w:t>
             </w:r>
@@ -1979,7 +1946,7 @@
               <w:rPr>
                 <w:rFonts w:ascii="Times New Roman" w:hAnsi="Times New Roman"/>
                 <w:b/>
-                <w:sz w:val="20"/>
+                <w:sz w:val="24"/>
               </w:rPr>
               <w:t>Residual risk</w:t>
             </w:r>
@@ -2012,7 +1979,7 @@
               <w:rPr>
                 <w:rFonts w:ascii="Times New Roman" w:hAnsi="Times New Roman"/>
                 <w:b w:val="0"/>
-                <w:sz w:val="20"/>
+                <w:sz w:val="24"/>
               </w:rPr>
               <w:t>Substitution</w:t>
             </w:r>
@@ -2043,7 +2010,7 @@
               <w:rPr>
                 <w:rFonts w:ascii="Times New Roman" w:hAnsi="Times New Roman"/>
                 <w:b w:val="0"/>
-                <w:sz w:val="20"/>
+                <w:sz w:val="24"/>
               </w:rPr>
               <w:t>Local digest and signature check</w:t>
             </w:r>
@@ -2074,7 +2041,7 @@
               <w:rPr>
                 <w:rFonts w:ascii="Times New Roman" w:hAnsi="Times New Roman"/>
                 <w:b w:val="0"/>
-                <w:sz w:val="20"/>
+                <w:sz w:val="24"/>
               </w:rPr>
               <w:t>Compromised endpoint</w:t>
             </w:r>
@@ -2107,7 +2074,7 @@
               <w:rPr>
                 <w:rFonts w:ascii="Times New Roman" w:hAnsi="Times New Roman"/>
                 <w:b w:val="0"/>
-                <w:sz w:val="20"/>
+                <w:sz w:val="24"/>
               </w:rPr>
               <w:t>Scope inflation</w:t>
             </w:r>
@@ -2138,7 +2105,7 @@
               <w:rPr>
                 <w:rFonts w:ascii="Times New Roman" w:hAnsi="Times New Roman"/>
                 <w:b w:val="0"/>
-                <w:sz w:val="20"/>
+                <w:sz w:val="24"/>
               </w:rPr>
               <w:t>Mandatory scope and limitations</w:t>
             </w:r>
@@ -2169,7 +2136,7 @@
               <w:rPr>
                 <w:rFonts w:ascii="Times New Roman" w:hAnsi="Times New Roman"/>
                 <w:b w:val="0"/>
-                <w:sz w:val="20"/>
+                <w:sz w:val="24"/>
               </w:rPr>
               <w:t>Deceptive wording</w:t>
             </w:r>
@@ -2202,7 +2169,7 @@
               <w:rPr>
                 <w:rFonts w:ascii="Times New Roman" w:hAnsi="Times New Roman"/>
                 <w:b w:val="0"/>
-                <w:sz w:val="20"/>
+                <w:sz w:val="24"/>
               </w:rPr>
               <w:t>Self-review</w:t>
             </w:r>
@@ -2233,7 +2200,7 @@
               <w:rPr>
                 <w:rFonts w:ascii="Times New Roman" w:hAnsi="Times New Roman"/>
                 <w:b w:val="0"/>
-                <w:sz w:val="20"/>
+                <w:sz w:val="24"/>
               </w:rPr>
               <w:t>Role and organization separation</w:t>
             </w:r>
@@ -2264,7 +2231,7 @@
               <w:rPr>
                 <w:rFonts w:ascii="Times New Roman" w:hAnsi="Times New Roman"/>
                 <w:b w:val="0"/>
-                <w:sz w:val="20"/>
+                <w:sz w:val="24"/>
               </w:rPr>
               <w:t>Collusion</w:t>
             </w:r>
@@ -2297,7 +2264,7 @@
               <w:rPr>
                 <w:rFonts w:ascii="Times New Roman" w:hAnsi="Times New Roman"/>
                 <w:b w:val="0"/>
-                <w:sz w:val="20"/>
+                <w:sz w:val="24"/>
               </w:rPr>
               <w:t>Stale evidence</w:t>
             </w:r>
@@ -2328,7 +2295,7 @@
               <w:rPr>
                 <w:rFonts w:ascii="Times New Roman" w:hAnsi="Times New Roman"/>
                 <w:b w:val="0"/>
-                <w:sz w:val="20"/>
+                <w:sz w:val="24"/>
               </w:rPr>
               <w:t>Expiry, revocation, supersession</w:t>
             </w:r>
@@ -2359,7 +2326,7 @@
               <w:rPr>
                 <w:rFonts w:ascii="Times New Roman" w:hAnsi="Times New Roman"/>
                 <w:b w:val="0"/>
-                <w:sz w:val="20"/>
+                <w:sz w:val="24"/>
               </w:rPr>
               <w:t>Publication delay</w:t>
             </w:r>
@@ -2392,7 +2359,7 @@
               <w:rPr>
                 <w:rFonts w:ascii="Times New Roman" w:hAnsi="Times New Roman"/>
                 <w:b w:val="0"/>
-                <w:sz w:val="20"/>
+                <w:sz w:val="24"/>
               </w:rPr>
               <w:t>Data leakage</w:t>
             </w:r>
@@ -2423,7 +2390,7 @@
               <w:rPr>
                 <w:rFonts w:ascii="Times New Roman" w:hAnsi="Times New Roman"/>
                 <w:b w:val="0"/>
-                <w:sz w:val="20"/>
+                <w:sz w:val="24"/>
               </w:rPr>
               <w:t>Off-chain evidence and minimization</w:t>
             </w:r>
@@ -2454,7 +2421,7 @@
               <w:rPr>
                 <w:rFonts w:ascii="Times New Roman" w:hAnsi="Times New Roman"/>
                 <w:b w:val="0"/>
-                <w:sz w:val="20"/>
+                <w:sz w:val="24"/>
               </w:rPr>
               <w:t>Metadata correlation</w:t>
             </w:r>
@@ -2488,7 +2455,7 @@
               <w:rPr>
                 <w:rFonts w:ascii="Times New Roman" w:hAnsi="Times New Roman"/>
                 <w:b w:val="0"/>
-                <w:sz w:val="20"/>
+                <w:sz w:val="24"/>
               </w:rPr>
               <w:t>Admin compromise</w:t>
             </w:r>
@@ -2520,7 +2487,7 @@
               <w:rPr>
                 <w:rFonts w:ascii="Times New Roman" w:hAnsi="Times New Roman"/>
                 <w:b w:val="0"/>
-                <w:sz w:val="20"/>
+                <w:sz w:val="24"/>
               </w:rPr>
               <w:t>Role separation, multisignature target, audit</w:t>
             </w:r>
@@ -2552,7 +2519,7 @@
               <w:rPr>
                 <w:rFonts w:ascii="Times New Roman" w:hAnsi="Times New Roman"/>
                 <w:b w:val="0"/>
-                <w:sz w:val="20"/>
+                <w:sz w:val="24"/>
               </w:rPr>
               <w:t>Key compromise</w:t>
             </w:r>
@@ -2562,13 +2529,8 @@
     </w:tbl>
     <w:p>
       <w:pPr>
-        <w:spacing w:line="240" w:lineRule="auto" w:after="120"/>
-      </w:pPr>
-    </w:p>
-    <w:p>
-      <w:pPr>
         <w:keepNext/>
-        <w:spacing w:line="480" w:lineRule="auto" w:before="360" w:after="160"/>
+        <w:spacing w:line="480" w:lineRule="auto" w:before="0" w:after="0"/>
         <w:jc w:val="center"/>
       </w:pPr>
       <w:r>
@@ -2581,7 +2543,7 @@
     <w:p>
       <w:pPr>
         <w:keepNext/>
-        <w:spacing w:line="480" w:lineRule="auto" w:before="280" w:after="120"/>
+        <w:spacing w:line="480" w:lineRule="auto" w:before="0" w:after="0"/>
         <w:jc w:val="left"/>
       </w:pPr>
       <w:r>
@@ -2593,7 +2555,7 @@
     </w:p>
     <w:p>
       <w:pPr>
-        <w:spacing w:line="480" w:lineRule="auto" w:after="140" w:before="0"/>
+        <w:spacing w:line="480" w:lineRule="auto" w:after="0" w:before="0"/>
         <w:ind w:firstLine="720"/>
       </w:pPr>
       <w:r>
@@ -2607,7 +2569,7 @@
     <w:p>
       <w:pPr>
         <w:keepNext/>
-        <w:spacing w:line="480" w:lineRule="auto" w:before="280" w:after="120"/>
+        <w:spacing w:line="480" w:lineRule="auto" w:before="0" w:after="0"/>
         <w:jc w:val="left"/>
       </w:pPr>
       <w:r>
@@ -2620,7 +2582,7 @@
     <w:p>
       <w:pPr>
         <w:keepNext/>
-        <w:spacing w:line="480" w:lineRule="auto" w:after="140" w:before="0"/>
+        <w:spacing w:line="480" w:lineRule="auto" w:after="0" w:before="0"/>
       </w:pPr>
       <w:r>
         <w:rPr>
@@ -2633,7 +2595,7 @@
     <w:p>
       <w:pPr>
         <w:keepNext/>
-        <w:spacing w:line="480" w:lineRule="auto" w:after="140" w:before="0"/>
+        <w:spacing w:line="480" w:lineRule="auto" w:after="0" w:before="0"/>
       </w:pPr>
       <w:r>
         <w:rPr>
@@ -2645,14 +2607,14 @@
     </w:p>
     <w:p>
       <w:pPr>
-        <w:spacing w:line="240" w:lineRule="auto" w:after="140" w:before="0"/>
+        <w:spacing w:line="240" w:lineRule="auto" w:after="0" w:before="0"/>
       </w:pPr>
       <w:r>
         <w:rPr>
           <w:rFonts w:ascii="Courier New" w:hAnsi="Courier New"/>
           <w:b w:val="0"/>
           <w:i w:val="0"/>
-          <w:sz w:val="18"/>
+          <w:sz w:val="20"/>
         </w:rPr>
         <w:t>INPUT: passport P, local artifact A, time t, policy Q</w:t>
         <w:br/>
@@ -2677,7 +2639,7 @@
     </w:p>
     <w:p>
       <w:pPr>
-        <w:spacing w:line="480" w:lineRule="auto" w:after="140" w:before="0"/>
+        <w:spacing w:line="480" w:lineRule="auto" w:after="0" w:before="0"/>
         <w:ind w:firstLine="720"/>
       </w:pPr>
       <w:r>
@@ -2691,7 +2653,7 @@
     <w:p>
       <w:pPr>
         <w:keepNext/>
-        <w:spacing w:line="480" w:lineRule="auto" w:before="280" w:after="120"/>
+        <w:spacing w:line="480" w:lineRule="auto" w:before="0" w:after="0"/>
         <w:jc w:val="left"/>
       </w:pPr>
       <w:r>
@@ -2703,7 +2665,7 @@
     </w:p>
     <w:p>
       <w:pPr>
-        <w:spacing w:line="480" w:lineRule="auto" w:after="140" w:before="0"/>
+        <w:spacing w:line="480" w:lineRule="auto" w:after="0" w:before="0"/>
         <w:ind w:firstLine="720"/>
       </w:pPr>
       <w:r>
@@ -2717,7 +2679,7 @@
     <w:p>
       <w:pPr>
         <w:keepNext/>
-        <w:spacing w:line="480" w:lineRule="auto" w:before="360" w:after="160"/>
+        <w:spacing w:line="480" w:lineRule="auto" w:before="0" w:after="0"/>
         <w:jc w:val="center"/>
       </w:pPr>
       <w:r>
@@ -2730,7 +2692,7 @@
     <w:p>
       <w:pPr>
         <w:keepNext/>
-        <w:spacing w:line="480" w:lineRule="auto" w:before="280" w:after="120"/>
+        <w:spacing w:line="480" w:lineRule="auto" w:before="0" w:after="0"/>
         <w:jc w:val="left"/>
       </w:pPr>
       <w:r>
@@ -2742,7 +2704,7 @@
     </w:p>
     <w:p>
       <w:pPr>
-        <w:spacing w:line="480" w:lineRule="auto" w:after="140" w:before="0"/>
+        <w:spacing w:line="480" w:lineRule="auto" w:after="0" w:before="0"/>
         <w:ind w:firstLine="720"/>
       </w:pPr>
       <w:r>
@@ -2750,13 +2712,13 @@
           <w:b w:val="0"/>
           <w:i w:val="0"/>
         </w:rPr>
-        <w:t>Study SS-DSR-PROTOTYPE-2026-10-29 executed three deterministic experiments and the repository contract suite. The mutation experiment generated 5,000 seeded byte strings, flipped one indexed bit in each string, and compared SHA-256 digests. The lifecycle reference model enumerated all 25 ordered pairs over Submitted, Validated, Rejected, Revoked, and Superseded. The performance test hashed a deterministic one-mebibyte payload 256 times using a monotonic nanosecond timer. Contract tests ran through the repository's npm test command.</w:t>
+        <w:t>Study SS-DSR-PROTOTYPE-2026-10-29 executed three deterministic experiments and the repository contract suite. The mutation experiment generated 5,000 seeded byte strings, flipped one indexed bit in each string, and compared SHA-256 digests. The lifecycle reference model enumerated all 25 ordered pairs over Submitted, Validated, Rejected, Revoked, and Superseded. The performance test hashed a deterministic one-mebibyte payload 256 times using a monotonic nanosecond timer. Contract tests ran through the repository's npm test command. Tables 4 and 5 report the observed measurements and contract-suite composition.</w:t>
       </w:r>
     </w:p>
     <w:p>
       <w:pPr>
         <w:keepNext/>
-        <w:spacing w:line="480" w:lineRule="auto" w:before="280" w:after="120"/>
+        <w:spacing w:line="480" w:lineRule="auto" w:before="0" w:after="0"/>
         <w:jc w:val="left"/>
       </w:pPr>
       <w:r>
@@ -2769,7 +2731,7 @@
     <w:p>
       <w:pPr>
         <w:keepNext/>
-        <w:spacing w:line="480" w:lineRule="auto" w:before="240" w:after="0"/>
+        <w:spacing w:line="480" w:lineRule="auto" w:before="0" w:after="0"/>
       </w:pPr>
       <w:r>
         <w:rPr>
@@ -2781,7 +2743,7 @@
     <w:p>
       <w:pPr>
         <w:keepNext/>
-        <w:spacing w:line="480" w:lineRule="auto" w:after="120"/>
+        <w:spacing w:line="480" w:lineRule="auto" w:after="0"/>
       </w:pPr>
       <w:r>
         <w:rPr>
@@ -2830,7 +2792,7 @@
               <w:rPr>
                 <w:rFonts w:ascii="Times New Roman" w:hAnsi="Times New Roman"/>
                 <w:b/>
-                <w:sz w:val="20"/>
+                <w:sz w:val="24"/>
               </w:rPr>
               <w:t>Experiment</w:t>
             </w:r>
@@ -2863,7 +2825,7 @@
               <w:rPr>
                 <w:rFonts w:ascii="Times New Roman" w:hAnsi="Times New Roman"/>
                 <w:b/>
-                <w:sz w:val="20"/>
+                <w:sz w:val="24"/>
               </w:rPr>
               <w:t>Observed result</w:t>
             </w:r>
@@ -2896,7 +2858,7 @@
               <w:rPr>
                 <w:rFonts w:ascii="Times New Roman" w:hAnsi="Times New Roman"/>
                 <w:b/>
-                <w:sz w:val="20"/>
+                <w:sz w:val="24"/>
               </w:rPr>
               <w:t>Boundary</w:t>
             </w:r>
@@ -2929,7 +2891,7 @@
               <w:rPr>
                 <w:rFonts w:ascii="Times New Roman" w:hAnsi="Times New Roman"/>
                 <w:b w:val="0"/>
-                <w:sz w:val="20"/>
+                <w:sz w:val="24"/>
               </w:rPr>
               <w:t>Contract suite</w:t>
             </w:r>
@@ -2960,7 +2922,7 @@
               <w:rPr>
                 <w:rFonts w:ascii="Times New Roman" w:hAnsi="Times New Roman"/>
                 <w:b w:val="0"/>
-                <w:sz w:val="20"/>
+                <w:sz w:val="24"/>
               </w:rPr>
               <w:t>15 passing; exit 0</w:t>
             </w:r>
@@ -2991,7 +2953,7 @@
               <w:rPr>
                 <w:rFonts w:ascii="Times New Roman" w:hAnsi="Times New Roman"/>
                 <w:b w:val="0"/>
-                <w:sz w:val="20"/>
+                <w:sz w:val="24"/>
               </w:rPr>
               <w:t>Not an audit</w:t>
             </w:r>
@@ -3024,7 +2986,7 @@
               <w:rPr>
                 <w:rFonts w:ascii="Times New Roman" w:hAnsi="Times New Roman"/>
                 <w:b w:val="0"/>
-                <w:sz w:val="20"/>
+                <w:sz w:val="24"/>
               </w:rPr>
               <w:t>Mutation corpus</w:t>
             </w:r>
@@ -3055,7 +3017,7 @@
               <w:rPr>
                 <w:rFonts w:ascii="Times New Roman" w:hAnsi="Times New Roman"/>
                 <w:b w:val="0"/>
-                <w:sz w:val="20"/>
+                <w:sz w:val="24"/>
               </w:rPr>
               <w:t>5000/5000 detected</w:t>
             </w:r>
@@ -3086,7 +3048,7 @@
               <w:rPr>
                 <w:rFonts w:ascii="Times New Roman" w:hAnsi="Times New Roman"/>
                 <w:b w:val="0"/>
-                <w:sz w:val="20"/>
+                <w:sz w:val="24"/>
               </w:rPr>
               <w:t>Byte changes only</w:t>
             </w:r>
@@ -3119,7 +3081,7 @@
               <w:rPr>
                 <w:rFonts w:ascii="Times New Roman" w:hAnsi="Times New Roman"/>
                 <w:b w:val="0"/>
-                <w:sz w:val="20"/>
+                <w:sz w:val="24"/>
               </w:rPr>
               <w:t>Lifecycle model</w:t>
             </w:r>
@@ -3150,7 +3112,7 @@
               <w:rPr>
                 <w:rFonts w:ascii="Times New Roman" w:hAnsi="Times New Roman"/>
                 <w:b w:val="0"/>
-                <w:sz w:val="20"/>
+                <w:sz w:val="24"/>
               </w:rPr>
               <w:t>25 pairs; 21 forbidden rejected</w:t>
             </w:r>
@@ -3181,7 +3143,7 @@
               <w:rPr>
                 <w:rFonts w:ascii="Times New Roman" w:hAnsi="Times New Roman"/>
                 <w:b w:val="0"/>
-                <w:sz w:val="20"/>
+                <w:sz w:val="24"/>
               </w:rPr>
               <w:t>Reference model</w:t>
             </w:r>
@@ -3215,7 +3177,7 @@
               <w:rPr>
                 <w:rFonts w:ascii="Times New Roman" w:hAnsi="Times New Roman"/>
                 <w:b w:val="0"/>
-                <w:sz w:val="20"/>
+                <w:sz w:val="24"/>
               </w:rPr>
               <w:t>SHA-256 benchmark</w:t>
             </w:r>
@@ -3247,7 +3209,7 @@
               <w:rPr>
                 <w:rFonts w:ascii="Times New Roman" w:hAnsi="Times New Roman"/>
                 <w:b w:val="0"/>
-                <w:sz w:val="20"/>
+                <w:sz w:val="24"/>
               </w:rPr>
               <w:t>Median 2.1396 ms; p95 2.7037 ms</w:t>
             </w:r>
@@ -3279,7 +3241,7 @@
               <w:rPr>
                 <w:rFonts w:ascii="Times New Roman" w:hAnsi="Times New Roman"/>
                 <w:b w:val="0"/>
-                <w:sz w:val="20"/>
+                <w:sz w:val="24"/>
               </w:rPr>
               <w:t>Single machine/run</w:t>
             </w:r>
@@ -3289,12 +3251,7 @@
     </w:tbl>
     <w:p>
       <w:pPr>
-        <w:spacing w:line="240" w:lineRule="auto" w:after="120"/>
-      </w:pPr>
-    </w:p>
-    <w:p>
-      <w:pPr>
-        <w:spacing w:line="480" w:lineRule="auto" w:after="140" w:before="0"/>
+        <w:spacing w:line="480" w:lineRule="auto" w:after="0" w:before="0"/>
         <w:ind w:firstLine="720"/>
       </w:pPr>
       <w:r>
@@ -3376,12 +3333,7 @@
     </w:tbl>
     <w:p>
       <w:pPr>
-        <w:spacing w:after="80" w:line="240" w:lineRule="auto"/>
-      </w:pPr>
-    </w:p>
-    <w:p>
-      <w:pPr>
-        <w:spacing w:line="480" w:lineRule="auto" w:after="140" w:before="0"/>
+        <w:spacing w:line="480" w:lineRule="auto" w:after="0" w:before="0"/>
         <w:ind w:firstLine="720"/>
       </w:pPr>
       <w:r>
@@ -3395,7 +3347,7 @@
     <w:p>
       <w:pPr>
         <w:keepNext/>
-        <w:spacing w:line="480" w:lineRule="auto" w:before="240" w:after="0"/>
+        <w:spacing w:line="480" w:lineRule="auto" w:before="0" w:after="0"/>
       </w:pPr>
       <w:r>
         <w:rPr>
@@ -3407,7 +3359,7 @@
     <w:p>
       <w:pPr>
         <w:keepNext/>
-        <w:spacing w:line="480" w:lineRule="auto" w:after="120"/>
+        <w:spacing w:line="480" w:lineRule="auto" w:after="0"/>
       </w:pPr>
       <w:r>
         <w:rPr>
@@ -3456,7 +3408,7 @@
               <w:rPr>
                 <w:rFonts w:ascii="Times New Roman" w:hAnsi="Times New Roman"/>
                 <w:b/>
-                <w:sz w:val="20"/>
+                <w:sz w:val="24"/>
               </w:rPr>
               <w:t>Component</w:t>
             </w:r>
@@ -3489,7 +3441,7 @@
               <w:rPr>
                 <w:rFonts w:ascii="Times New Roman" w:hAnsi="Times New Roman"/>
                 <w:b/>
-                <w:sz w:val="20"/>
+                <w:sz w:val="24"/>
               </w:rPr>
               <w:t>Tests</w:t>
             </w:r>
@@ -3522,7 +3474,7 @@
               <w:rPr>
                 <w:rFonts w:ascii="Times New Roman" w:hAnsi="Times New Roman"/>
                 <w:b/>
-                <w:sz w:val="20"/>
+                <w:sz w:val="24"/>
               </w:rPr>
               <w:t>Primary behaviors</w:t>
             </w:r>
@@ -3555,7 +3507,7 @@
               <w:rPr>
                 <w:rFonts w:ascii="Times New Roman" w:hAnsi="Times New Roman"/>
                 <w:b w:val="0"/>
-                <w:sz w:val="20"/>
+                <w:sz w:val="24"/>
               </w:rPr>
               <w:t>Assurance core</w:t>
             </w:r>
@@ -3586,7 +3538,7 @@
               <w:rPr>
                 <w:rFonts w:ascii="Times New Roman" w:hAnsi="Times New Roman"/>
                 <w:b w:val="0"/>
-                <w:sz w:val="20"/>
+                <w:sz w:val="24"/>
               </w:rPr>
               <w:t>4</w:t>
             </w:r>
@@ -3617,7 +3569,7 @@
               <w:rPr>
                 <w:rFonts w:ascii="Times New Roman" w:hAnsi="Times New Roman"/>
                 <w:b w:val="0"/>
-                <w:sz w:val="20"/>
+                <w:sz w:val="24"/>
               </w:rPr>
               <w:t>Commitments, independent review, supersession</w:t>
             </w:r>
@@ -3650,7 +3602,7 @@
               <w:rPr>
                 <w:rFonts w:ascii="Times New Roman" w:hAnsi="Times New Roman"/>
                 <w:b w:val="0"/>
-                <w:sz w:val="20"/>
+                <w:sz w:val="24"/>
               </w:rPr>
               <w:t>Research core</w:t>
             </w:r>
@@ -3681,7 +3633,7 @@
               <w:rPr>
                 <w:rFonts w:ascii="Times New Roman" w:hAnsi="Times New Roman"/>
                 <w:b w:val="0"/>
-                <w:sz w:val="20"/>
+                <w:sz w:val="24"/>
               </w:rPr>
               <w:t>6</w:t>
             </w:r>
@@ -3712,7 +3664,7 @@
               <w:rPr>
                 <w:rFonts w:ascii="Times New Roman" w:hAnsi="Times New Roman"/>
                 <w:b w:val="0"/>
-                <w:sz w:val="20"/>
+                <w:sz w:val="24"/>
               </w:rPr>
               <w:t>Evidence validation, authorization, immutability</w:t>
             </w:r>
@@ -3746,7 +3698,7 @@
               <w:rPr>
                 <w:rFonts w:ascii="Times New Roman" w:hAnsi="Times New Roman"/>
                 <w:b w:val="0"/>
-                <w:sz w:val="20"/>
+                <w:sz w:val="24"/>
               </w:rPr>
               <w:t>Token candidate</w:t>
             </w:r>
@@ -3778,7 +3730,7 @@
               <w:rPr>
                 <w:rFonts w:ascii="Times New Roman" w:hAnsi="Times New Roman"/>
                 <w:b w:val="0"/>
-                <w:sz w:val="20"/>
+                <w:sz w:val="24"/>
               </w:rPr>
               <w:t>5</w:t>
             </w:r>
@@ -3810,7 +3762,7 @@
               <w:rPr>
                 <w:rFonts w:ascii="Times New Roman" w:hAnsi="Times New Roman"/>
                 <w:b w:val="0"/>
-                <w:sz w:val="20"/>
+                <w:sz w:val="24"/>
               </w:rPr>
               <w:t>Fixed allocation, role separation, pause controls</w:t>
             </w:r>
@@ -3820,12 +3772,7 @@
     </w:tbl>
     <w:p>
       <w:pPr>
-        <w:spacing w:line="240" w:lineRule="auto" w:after="120"/>
-      </w:pPr>
-    </w:p>
-    <w:p>
-      <w:pPr>
-        <w:spacing w:line="480" w:lineRule="auto" w:after="140" w:before="0"/>
+        <w:spacing w:line="480" w:lineRule="auto" w:after="0" w:before="0"/>
         <w:ind w:firstLine="720"/>
       </w:pPr>
       <w:r>
@@ -3839,7 +3786,7 @@
     <w:p>
       <w:pPr>
         <w:keepNext/>
-        <w:spacing w:line="480" w:lineRule="auto" w:before="360" w:after="160"/>
+        <w:spacing w:line="480" w:lineRule="auto" w:before="0" w:after="0"/>
         <w:jc w:val="center"/>
       </w:pPr>
       <w:r>
@@ -3851,7 +3798,7 @@
     </w:p>
     <w:p>
       <w:pPr>
-        <w:spacing w:line="480" w:lineRule="auto" w:after="140" w:before="0"/>
+        <w:spacing w:line="480" w:lineRule="auto" w:after="0" w:before="0"/>
         <w:ind w:firstLine="720"/>
       </w:pPr>
       <w:r>
@@ -3859,13 +3806,13 @@
           <w:b w:val="0"/>
           <w:i w:val="0"/>
         </w:rPr>
-        <w:t>A controlled study will compare four conditions: raw digest exchange; a signed centralized JSON record; a W3C Verifiable Credential passport without a ledger; and Sampling Sigma with an optional shared registry. Participants will issue and verify identical evidence packages containing altered, expired, superseded, conflicted, and out-of-scope cases. An exploratory pilot of 24 to 30 participants will test the instruments and estimate variance. A confirmatory sample will then be determined by preregistered power analysis using a declared smallest effect of interest.</w:t>
+        <w:t>A controlled study will compare four conditions: raw digest exchange; a signed centralized JSON record; a W3C Verifiable Credential passport without a ledger; and Sampling Sigma with an optional shared registry. Participants will issue and verify identical evidence packages containing altered, expired, superseded, conflicted, and out-of-scope cases. An exploratory pilot of 24 to 30 participants will test the instruments and estimate variance. A confirmatory sample will then be determined by preregistered power analysis using a declared smallest effect of interest. Table 6 defines the planned outcomes and analyses.</w:t>
       </w:r>
     </w:p>
     <w:p>
       <w:pPr>
         <w:keepNext/>
-        <w:spacing w:line="480" w:lineRule="auto" w:before="240" w:after="0"/>
+        <w:spacing w:line="480" w:lineRule="auto" w:before="0" w:after="0"/>
       </w:pPr>
       <w:r>
         <w:rPr>
@@ -3877,7 +3824,7 @@
     <w:p>
       <w:pPr>
         <w:keepNext/>
-        <w:spacing w:line="480" w:lineRule="auto" w:after="120"/>
+        <w:spacing w:line="480" w:lineRule="auto" w:after="0"/>
       </w:pPr>
       <w:r>
         <w:rPr>
@@ -3926,7 +3873,7 @@
               <w:rPr>
                 <w:rFonts w:ascii="Times New Roman" w:hAnsi="Times New Roman"/>
                 <w:b/>
-                <w:sz w:val="20"/>
+                <w:sz w:val="24"/>
               </w:rPr>
               <w:t>Outcome</w:t>
             </w:r>
@@ -3959,7 +3906,7 @@
               <w:rPr>
                 <w:rFonts w:ascii="Times New Roman" w:hAnsi="Times New Roman"/>
                 <w:b/>
-                <w:sz w:val="20"/>
+                <w:sz w:val="24"/>
               </w:rPr>
               <w:t>Definition</w:t>
             </w:r>
@@ -3992,7 +3939,7 @@
               <w:rPr>
                 <w:rFonts w:ascii="Times New Roman" w:hAnsi="Times New Roman"/>
                 <w:b/>
-                <w:sz w:val="20"/>
+                <w:sz w:val="24"/>
               </w:rPr>
               <w:t>Analysis</w:t>
             </w:r>
@@ -4025,7 +3972,7 @@
               <w:rPr>
                 <w:rFonts w:ascii="Times New Roman" w:hAnsi="Times New Roman"/>
                 <w:b w:val="0"/>
-                <w:sz w:val="20"/>
+                <w:sz w:val="24"/>
               </w:rPr>
               <w:t>Accuracy</w:t>
             </w:r>
@@ -4056,7 +4003,7 @@
               <w:rPr>
                 <w:rFonts w:ascii="Times New Roman" w:hAnsi="Times New Roman"/>
                 <w:b w:val="0"/>
-                <w:sz w:val="20"/>
+                <w:sz w:val="24"/>
               </w:rPr>
               <w:t>Correct accept/reject decision</w:t>
             </w:r>
@@ -4087,7 +4034,7 @@
               <w:rPr>
                 <w:rFonts w:ascii="Times New Roman" w:hAnsi="Times New Roman"/>
                 <w:b w:val="0"/>
-                <w:sz w:val="20"/>
+                <w:sz w:val="24"/>
               </w:rPr>
               <w:t>Mixed logistic model</w:t>
             </w:r>
@@ -4120,7 +4067,7 @@
               <w:rPr>
                 <w:rFonts w:ascii="Times New Roman" w:hAnsi="Times New Roman"/>
                 <w:b w:val="0"/>
-                <w:sz w:val="20"/>
+                <w:sz w:val="24"/>
               </w:rPr>
               <w:t>Time</w:t>
             </w:r>
@@ -4151,7 +4098,7 @@
               <w:rPr>
                 <w:rFonts w:ascii="Times New Roman" w:hAnsi="Times New Roman"/>
                 <w:b w:val="0"/>
-                <w:sz w:val="20"/>
+                <w:sz w:val="24"/>
               </w:rPr>
               <w:t>Seconds to defensible decision</w:t>
             </w:r>
@@ -4182,7 +4129,7 @@
               <w:rPr>
                 <w:rFonts w:ascii="Times New Roman" w:hAnsi="Times New Roman"/>
                 <w:b w:val="0"/>
-                <w:sz w:val="20"/>
+                <w:sz w:val="24"/>
               </w:rPr>
               <w:t>Survival/log-normal model</w:t>
             </w:r>
@@ -4215,7 +4162,7 @@
               <w:rPr>
                 <w:rFonts w:ascii="Times New Roman" w:hAnsi="Times New Roman"/>
                 <w:b w:val="0"/>
-                <w:sz w:val="20"/>
+                <w:sz w:val="24"/>
               </w:rPr>
               <w:t>Critical error</w:t>
             </w:r>
@@ -4246,7 +4193,7 @@
               <w:rPr>
                 <w:rFonts w:ascii="Times New Roman" w:hAnsi="Times New Roman"/>
                 <w:b w:val="0"/>
-                <w:sz w:val="20"/>
+                <w:sz w:val="24"/>
               </w:rPr>
               <w:t>Invalid accepted or valid rejected</w:t>
             </w:r>
@@ -4277,7 +4224,7 @@
               <w:rPr>
                 <w:rFonts w:ascii="Times New Roman" w:hAnsi="Times New Roman"/>
                 <w:b w:val="0"/>
-                <w:sz w:val="20"/>
+                <w:sz w:val="24"/>
               </w:rPr>
               <w:t>Risk difference and CI</w:t>
             </w:r>
@@ -4310,7 +4257,7 @@
               <w:rPr>
                 <w:rFonts w:ascii="Times New Roman" w:hAnsi="Times New Roman"/>
                 <w:b w:val="0"/>
-                <w:sz w:val="20"/>
+                <w:sz w:val="24"/>
               </w:rPr>
               <w:t>Completeness</w:t>
             </w:r>
@@ -4341,7 +4288,7 @@
               <w:rPr>
                 <w:rFonts w:ascii="Times New Roman" w:hAnsi="Times New Roman"/>
                 <w:b w:val="0"/>
-                <w:sz w:val="20"/>
+                <w:sz w:val="24"/>
               </w:rPr>
               <w:t>Required context interpreted</w:t>
             </w:r>
@@ -4372,7 +4319,7 @@
               <w:rPr>
                 <w:rFonts w:ascii="Times New Roman" w:hAnsi="Times New Roman"/>
                 <w:b w:val="0"/>
-                <w:sz w:val="20"/>
+                <w:sz w:val="24"/>
               </w:rPr>
               <w:t>Rubric and agreement</w:t>
             </w:r>
@@ -4405,7 +4352,7 @@
               <w:rPr>
                 <w:rFonts w:ascii="Times New Roman" w:hAnsi="Times New Roman"/>
                 <w:b w:val="0"/>
-                <w:sz w:val="20"/>
+                <w:sz w:val="24"/>
               </w:rPr>
               <w:t>Privacy</w:t>
             </w:r>
@@ -4436,7 +4383,7 @@
               <w:rPr>
                 <w:rFonts w:ascii="Times New Roman" w:hAnsi="Times New Roman"/>
                 <w:b w:val="0"/>
-                <w:sz w:val="20"/>
+                <w:sz w:val="24"/>
               </w:rPr>
               <w:t>Evidence bytes transmitted</w:t>
             </w:r>
@@ -4467,7 +4414,7 @@
               <w:rPr>
                 <w:rFonts w:ascii="Times New Roman" w:hAnsi="Times New Roman"/>
                 <w:b w:val="0"/>
-                <w:sz w:val="20"/>
+                <w:sz w:val="24"/>
               </w:rPr>
               <w:t>Network capture</w:t>
             </w:r>
@@ -4501,7 +4448,7 @@
               <w:rPr>
                 <w:rFonts w:ascii="Times New Roman" w:hAnsi="Times New Roman"/>
                 <w:b w:val="0"/>
-                <w:sz w:val="20"/>
+                <w:sz w:val="24"/>
               </w:rPr>
               <w:t>Usability</w:t>
             </w:r>
@@ -4533,7 +4480,7 @@
               <w:rPr>
                 <w:rFonts w:ascii="Times New Roman" w:hAnsi="Times New Roman"/>
                 <w:b w:val="0"/>
-                <w:sz w:val="20"/>
+                <w:sz w:val="24"/>
               </w:rPr>
               <w:t>SUS and task workload</w:t>
             </w:r>
@@ -4565,7 +4512,7 @@
               <w:rPr>
                 <w:rFonts w:ascii="Times New Roman" w:hAnsi="Times New Roman"/>
                 <w:b w:val="0"/>
-                <w:sz w:val="20"/>
+                <w:sz w:val="24"/>
               </w:rPr>
               <w:t>CI and effect size</w:t>
             </w:r>
@@ -4575,12 +4522,7 @@
     </w:tbl>
     <w:p>
       <w:pPr>
-        <w:spacing w:line="240" w:lineRule="auto" w:after="120"/>
-      </w:pPr>
-    </w:p>
-    <w:p>
-      <w:pPr>
-        <w:spacing w:line="480" w:lineRule="auto" w:after="140" w:before="0"/>
+        <w:spacing w:line="480" w:lineRule="auto" w:after="0" w:before="0"/>
         <w:ind w:firstLine="720"/>
       </w:pPr>
       <w:r>
@@ -4594,7 +4536,7 @@
     <w:p>
       <w:pPr>
         <w:keepNext/>
-        <w:spacing w:line="480" w:lineRule="auto" w:before="360" w:after="160"/>
+        <w:spacing w:line="480" w:lineRule="auto" w:before="0" w:after="0"/>
         <w:jc w:val="center"/>
       </w:pPr>
       <w:r>
@@ -4606,7 +4548,7 @@
     </w:p>
     <w:p>
       <w:pPr>
-        <w:spacing w:line="480" w:lineRule="auto" w:after="140" w:before="0"/>
+        <w:spacing w:line="480" w:lineRule="auto" w:after="0" w:before="0"/>
         <w:ind w:firstLine="720"/>
       </w:pPr>
       <w:r>
@@ -4619,7 +4561,7 @@
     </w:p>
     <w:p>
       <w:pPr>
-        <w:spacing w:line="480" w:lineRule="auto" w:after="120"/>
+        <w:spacing w:line="480" w:lineRule="auto" w:after="0"/>
         <w:ind w:left="720" w:hanging="360"/>
       </w:pPr>
       <w:r>
@@ -4630,7 +4572,7 @@
     </w:p>
     <w:p>
       <w:pPr>
-        <w:spacing w:line="480" w:lineRule="auto" w:after="120"/>
+        <w:spacing w:line="480" w:lineRule="auto" w:after="0"/>
         <w:ind w:left="720" w:hanging="360"/>
       </w:pPr>
       <w:r>
@@ -4641,7 +4583,7 @@
     </w:p>
     <w:p>
       <w:pPr>
-        <w:spacing w:line="480" w:lineRule="auto" w:after="120"/>
+        <w:spacing w:line="480" w:lineRule="auto" w:after="0"/>
         <w:ind w:left="720" w:hanging="360"/>
       </w:pPr>
       <w:r>
@@ -4652,7 +4594,7 @@
     </w:p>
     <w:p>
       <w:pPr>
-        <w:spacing w:line="480" w:lineRule="auto" w:after="120"/>
+        <w:spacing w:line="480" w:lineRule="auto" w:after="0"/>
         <w:ind w:left="720" w:hanging="360"/>
       </w:pPr>
       <w:r>
@@ -4663,7 +4605,7 @@
     </w:p>
     <w:p>
       <w:pPr>
-        <w:spacing w:line="480" w:lineRule="auto" w:after="120"/>
+        <w:spacing w:line="480" w:lineRule="auto" w:after="0"/>
         <w:ind w:left="720" w:hanging="360"/>
       </w:pPr>
       <w:r>
@@ -4675,7 +4617,7 @@
     <w:p>
       <w:pPr>
         <w:keepNext/>
-        <w:spacing w:line="480" w:lineRule="auto" w:before="360" w:after="160"/>
+        <w:spacing w:line="480" w:lineRule="auto" w:before="0" w:after="0"/>
         <w:jc w:val="center"/>
       </w:pPr>
       <w:r>
@@ -4688,7 +4630,7 @@
     <w:p>
       <w:pPr>
         <w:keepNext/>
-        <w:spacing w:line="480" w:lineRule="auto" w:before="280" w:after="120"/>
+        <w:spacing w:line="480" w:lineRule="auto" w:before="0" w:after="0"/>
         <w:jc w:val="left"/>
       </w:pPr>
       <w:r>
@@ -4700,7 +4642,7 @@
     </w:p>
     <w:p>
       <w:pPr>
-        <w:spacing w:line="480" w:lineRule="auto" w:after="140" w:before="0"/>
+        <w:spacing w:line="480" w:lineRule="auto" w:after="0" w:before="0"/>
         <w:ind w:firstLine="720"/>
       </w:pPr>
       <w:r>
@@ -4714,7 +4656,7 @@
     <w:p>
       <w:pPr>
         <w:keepNext/>
-        <w:spacing w:line="480" w:lineRule="auto" w:before="280" w:after="120"/>
+        <w:spacing w:line="480" w:lineRule="auto" w:before="0" w:after="0"/>
         <w:jc w:val="left"/>
       </w:pPr>
       <w:r>
@@ -4726,7 +4668,7 @@
     </w:p>
     <w:p>
       <w:pPr>
-        <w:spacing w:line="480" w:lineRule="auto" w:after="140" w:before="0"/>
+        <w:spacing w:line="480" w:lineRule="auto" w:after="0" w:before="0"/>
         <w:ind w:firstLine="720"/>
       </w:pPr>
       <w:r>
@@ -4740,7 +4682,7 @@
     <w:p>
       <w:pPr>
         <w:keepNext/>
-        <w:spacing w:line="480" w:lineRule="auto" w:before="280" w:after="120"/>
+        <w:spacing w:line="480" w:lineRule="auto" w:before="0" w:after="0"/>
         <w:jc w:val="left"/>
       </w:pPr>
       <w:r>
@@ -4752,7 +4694,7 @@
     </w:p>
     <w:p>
       <w:pPr>
-        <w:spacing w:line="480" w:lineRule="auto" w:after="140" w:before="0"/>
+        <w:spacing w:line="480" w:lineRule="auto" w:after="0" w:before="0"/>
         <w:ind w:firstLine="720"/>
       </w:pPr>
       <w:r>
@@ -4766,7 +4708,7 @@
     <w:p>
       <w:pPr>
         <w:keepNext/>
-        <w:spacing w:line="480" w:lineRule="auto" w:before="360" w:after="160"/>
+        <w:spacing w:line="480" w:lineRule="auto" w:before="0" w:after="0"/>
         <w:jc w:val="center"/>
       </w:pPr>
       <w:r>
@@ -4778,7 +4720,7 @@
     </w:p>
     <w:p>
       <w:pPr>
-        <w:spacing w:line="480" w:lineRule="auto" w:after="140" w:before="0"/>
+        <w:spacing w:line="480" w:lineRule="auto" w:after="0" w:before="0"/>
         <w:ind w:firstLine="720"/>
       </w:pPr>
       <w:r>
@@ -4792,7 +4734,7 @@
     <w:p>
       <w:pPr>
         <w:keepNext/>
-        <w:spacing w:line="480" w:lineRule="auto" w:before="360" w:after="160"/>
+        <w:spacing w:line="480" w:lineRule="auto" w:before="0" w:after="0"/>
         <w:jc w:val="center"/>
       </w:pPr>
       <w:r>
@@ -4804,7 +4746,7 @@
     </w:p>
     <w:p>
       <w:pPr>
-        <w:spacing w:line="480" w:lineRule="auto" w:after="120"/>
+        <w:spacing w:line="480" w:lineRule="auto" w:after="0"/>
         <w:ind w:left="720" w:hanging="360"/>
       </w:pPr>
       <w:r>
@@ -4815,7 +4757,7 @@
     </w:p>
     <w:p>
       <w:pPr>
-        <w:spacing w:line="480" w:lineRule="auto" w:after="120"/>
+        <w:spacing w:line="480" w:lineRule="auto" w:after="0"/>
         <w:ind w:left="720" w:hanging="360"/>
       </w:pPr>
       <w:r>
@@ -4826,7 +4768,7 @@
     </w:p>
     <w:p>
       <w:pPr>
-        <w:spacing w:line="480" w:lineRule="auto" w:after="120"/>
+        <w:spacing w:line="480" w:lineRule="auto" w:after="0"/>
         <w:ind w:left="720" w:hanging="360"/>
       </w:pPr>
       <w:r>
@@ -4837,7 +4779,7 @@
     </w:p>
     <w:p>
       <w:pPr>
-        <w:spacing w:line="480" w:lineRule="auto" w:after="120"/>
+        <w:spacing w:line="480" w:lineRule="auto" w:after="0"/>
         <w:ind w:left="720" w:hanging="360"/>
       </w:pPr>
       <w:r>
@@ -4848,7 +4790,7 @@
     </w:p>
     <w:p>
       <w:pPr>
-        <w:spacing w:line="480" w:lineRule="auto" w:after="120"/>
+        <w:spacing w:line="480" w:lineRule="auto" w:after="0"/>
         <w:ind w:left="720" w:hanging="360"/>
       </w:pPr>
       <w:r>
@@ -4860,7 +4802,7 @@
     <w:p>
       <w:pPr>
         <w:keepNext/>
-        <w:spacing w:line="480" w:lineRule="auto" w:before="360" w:after="160"/>
+        <w:spacing w:line="480" w:lineRule="auto" w:before="0" w:after="0"/>
         <w:jc w:val="center"/>
       </w:pPr>
       <w:r>
@@ -4872,7 +4814,7 @@
     </w:p>
     <w:p>
       <w:pPr>
-        <w:spacing w:line="480" w:lineRule="auto" w:after="140" w:before="0"/>
+        <w:spacing w:line="480" w:lineRule="auto" w:after="0" w:before="0"/>
         <w:ind w:firstLine="720"/>
       </w:pPr>
       <w:r>
@@ -4886,7 +4828,7 @@
     <w:p>
       <w:pPr>
         <w:keepNext/>
-        <w:spacing w:line="480" w:lineRule="auto" w:before="360" w:after="160"/>
+        <w:spacing w:line="480" w:lineRule="auto" w:before="0" w:after="0"/>
         <w:jc w:val="center"/>
       </w:pPr>
       <w:r>
@@ -4898,7 +4840,7 @@
     </w:p>
     <w:p>
       <w:pPr>
-        <w:spacing w:line="480" w:lineRule="auto" w:after="140" w:before="0"/>
+        <w:spacing w:line="480" w:lineRule="auto" w:after="0" w:before="0"/>
         <w:ind w:firstLine="720"/>
       </w:pPr>
       <w:r>
@@ -4906,13 +4848,13 @@
           <w:b w:val="0"/>
           <w:i w:val="0"/>
         </w:rPr>
-        <w:t>OpenAI ChatGPT (OpenAI, 2026a) and Codex (OpenAI, 2026b) were used for editorial restructuring, software-development assistance, preparation of the reproducible evaluation harness, and document formatting. The author reviewed the manuscript, source code, citations, experiments, and submission statements and independently executed the reported tests. Generated text was not treated as empirical evidence.</w:t>
+        <w:t>OpenAI ChatGPT (OpenAI, 2026a) and Codex (OpenAI, 2026b) were used for editorial restructuring, software-development assistance, preparation of the reproducible evaluation harness, and document formatting in the Abstract, Sections I-XIII, and Appendix A. The author reviewed the manuscript, source code, citations, experiments, and submission statements and independently executed the reported tests. Generated text was not treated as empirical evidence.</w:t>
       </w:r>
     </w:p>
     <w:p>
       <w:pPr>
         <w:keepNext/>
-        <w:spacing w:line="480" w:lineRule="auto" w:before="360" w:after="160"/>
+        <w:spacing w:line="480" w:lineRule="auto" w:before="0" w:after="0"/>
         <w:jc w:val="center"/>
       </w:pPr>
       <w:r>
@@ -4924,7 +4866,7 @@
     </w:p>
     <w:p>
       <w:pPr>
-        <w:spacing w:line="480" w:lineRule="auto" w:after="140" w:before="0"/>
+        <w:spacing w:line="480" w:lineRule="auto" w:after="0" w:before="0"/>
         <w:ind w:firstLine="720"/>
       </w:pPr>
       <w:r>
@@ -4932,13 +4874,18 @@
           <w:b w:val="0"/>
           <w:i w:val="0"/>
         </w:rPr>
-        <w:t>The prototype source, dependency lock file, complete contract tests, evaluation script, raw JSON measurements, test transcript, checksum manifest, and submission-candidate manuscript are publicly available at https://github.com/SriMurukutla/sampling-sigma-evidence-passports. The paper's evaluated snapshot is commit 3df129504776c6313f0b4a03ec0f242caa88a94d. The repository is public under the MIT License for code; no independent audit, production approval, or regulatory determination is implied.</w:t>
+        <w:t>The prototype source, dependency lock file, complete contract tests, evaluation script, raw JSON measurements, test transcript, checksum manifest, and submission-candidate manuscript are publicly available at https://github.com/SriMurukutla/sampling-sigma-evidence-passports. The paper's evaluated snapshot is commit 3df129504776c6313f0b4a03ec0f242caa88a94d. The repository is public under the MIT License for code; no independent audit, production approval, or regulatory determination is implied. Table 7 lists the minimum reproducibility artifacts.</w:t>
+      </w:r>
+    </w:p>
+    <w:p>
+      <w:r>
+        <w:br w:type="page"/>
       </w:r>
     </w:p>
     <w:p>
       <w:pPr>
         <w:keepNext/>
-        <w:spacing w:line="480" w:lineRule="auto" w:before="360" w:after="160"/>
+        <w:spacing w:line="480" w:lineRule="auto" w:before="0" w:after="0"/>
         <w:jc w:val="center"/>
       </w:pPr>
       <w:r>
@@ -4951,7 +4898,7 @@
     <w:p>
       <w:pPr>
         <w:keepNext/>
-        <w:spacing w:line="480" w:lineRule="auto" w:before="240" w:after="0"/>
+        <w:spacing w:line="480" w:lineRule="auto" w:before="0" w:after="0"/>
       </w:pPr>
       <w:r>
         <w:rPr>
@@ -4963,7 +4910,7 @@
     <w:p>
       <w:pPr>
         <w:keepNext/>
-        <w:spacing w:line="480" w:lineRule="auto" w:after="120"/>
+        <w:spacing w:line="480" w:lineRule="auto" w:after="0"/>
       </w:pPr>
       <w:r>
         <w:rPr>
@@ -5011,7 +4958,7 @@
               <w:rPr>
                 <w:rFonts w:ascii="Times New Roman" w:hAnsi="Times New Roman"/>
                 <w:b/>
-                <w:sz w:val="20"/>
+                <w:sz w:val="24"/>
               </w:rPr>
               <w:t>Artifact</w:t>
             </w:r>
@@ -5044,7 +4991,7 @@
               <w:rPr>
                 <w:rFonts w:ascii="Times New Roman" w:hAnsi="Times New Roman"/>
                 <w:b/>
-                <w:sz w:val="20"/>
+                <w:sz w:val="24"/>
               </w:rPr>
               <w:t>Purpose</w:t>
             </w:r>
@@ -5077,7 +5024,7 @@
               <w:rPr>
                 <w:rFonts w:ascii="Times New Roman" w:hAnsi="Times New Roman"/>
                 <w:b w:val="0"/>
-                <w:sz w:val="20"/>
+                <w:sz w:val="24"/>
               </w:rPr>
               <w:t>contracts/SamplingSigmaAssuranceCore.sol</w:t>
             </w:r>
@@ -5108,7 +5055,7 @@
               <w:rPr>
                 <w:rFonts w:ascii="Times New Roman" w:hAnsi="Times New Roman"/>
                 <w:b w:val="0"/>
-                <w:sz w:val="20"/>
+                <w:sz w:val="24"/>
               </w:rPr>
               <w:t>Assurance record and lifecycle implementation</w:t>
             </w:r>
@@ -5141,7 +5088,7 @@
               <w:rPr>
                 <w:rFonts w:ascii="Times New Roman" w:hAnsi="Times New Roman"/>
                 <w:b w:val="0"/>
-                <w:sz w:val="20"/>
+                <w:sz w:val="24"/>
               </w:rPr>
               <w:t>test/SamplingSigmaAssuranceCore.ts</w:t>
             </w:r>
@@ -5172,7 +5119,7 @@
               <w:rPr>
                 <w:rFonts w:ascii="Times New Roman" w:hAnsi="Times New Roman"/>
                 <w:b w:val="0"/>
-                <w:sz w:val="20"/>
+                <w:sz w:val="24"/>
               </w:rPr>
               <w:t>Assurance-core behavioral tests</w:t>
             </w:r>
@@ -5205,7 +5152,7 @@
               <w:rPr>
                 <w:rFonts w:ascii="Times New Roman" w:hAnsi="Times New Roman"/>
                 <w:b w:val="0"/>
-                <w:sz w:val="20"/>
+                <w:sz w:val="24"/>
               </w:rPr>
               <w:t>tools/research_evaluation.py</w:t>
             </w:r>
@@ -5236,7 +5183,7 @@
               <w:rPr>
                 <w:rFonts w:ascii="Times New Roman" w:hAnsi="Times New Roman"/>
                 <w:b w:val="0"/>
-                <w:sz w:val="20"/>
+                <w:sz w:val="24"/>
               </w:rPr>
               <w:t>Mutation, lifecycle, benchmark, and test harness</w:t>
             </w:r>
@@ -5269,7 +5216,7 @@
               <w:rPr>
                 <w:rFonts w:ascii="Times New Roman" w:hAnsi="Times New Roman"/>
                 <w:b w:val="0"/>
-                <w:sz w:val="20"/>
+                <w:sz w:val="24"/>
               </w:rPr>
               <w:t>evaluation/actual-prototype-results.json</w:t>
             </w:r>
@@ -5300,7 +5247,7 @@
               <w:rPr>
                 <w:rFonts w:ascii="Times New Roman" w:hAnsi="Times New Roman"/>
                 <w:b w:val="0"/>
-                <w:sz w:val="20"/>
+                <w:sz w:val="24"/>
               </w:rPr>
               <w:t>Machine-readable observed measurements</w:t>
             </w:r>
@@ -5334,7 +5281,7 @@
               <w:rPr>
                 <w:rFonts w:ascii="Times New Roman" w:hAnsi="Times New Roman"/>
                 <w:b w:val="0"/>
-                <w:sz w:val="20"/>
+                <w:sz w:val="24"/>
               </w:rPr>
               <w:t>evaluation/hardhat-test-output.txt</w:t>
             </w:r>
@@ -5366,7 +5313,7 @@
               <w:rPr>
                 <w:rFonts w:ascii="Times New Roman" w:hAnsi="Times New Roman"/>
                 <w:b w:val="0"/>
-                <w:sz w:val="20"/>
+                <w:sz w:val="24"/>
               </w:rPr>
               <w:t>Recorded contract-test output</w:t>
             </w:r>
@@ -5376,12 +5323,7 @@
     </w:tbl>
     <w:p>
       <w:pPr>
-        <w:spacing w:line="240" w:lineRule="auto" w:after="120"/>
-      </w:pPr>
-    </w:p>
-    <w:p>
-      <w:pPr>
-        <w:spacing w:line="480" w:lineRule="auto" w:after="140" w:before="0"/>
+        <w:spacing w:line="480" w:lineRule="auto" w:after="0" w:before="0"/>
         <w:ind w:firstLine="720"/>
       </w:pPr>
       <w:r>
@@ -5400,7 +5342,7 @@
     <w:p>
       <w:pPr>
         <w:keepNext/>
-        <w:spacing w:line="480" w:lineRule="auto" w:before="360" w:after="160"/>
+        <w:spacing w:line="480" w:lineRule="auto" w:before="0" w:after="0"/>
         <w:jc w:val="center"/>
       </w:pPr>
       <w:r>
@@ -5412,184 +5354,338 @@
     </w:p>
     <w:p>
       <w:pPr>
-        <w:spacing w:line="480" w:lineRule="auto" w:after="140" w:before="0"/>
+        <w:spacing w:line="480" w:lineRule="auto" w:before="0" w:after="0"/>
         <w:ind w:left="720" w:hanging="720"/>
       </w:pPr>
       <w:r>
         <w:rPr>
-          <w:b w:val="0"/>
           <w:i w:val="0"/>
         </w:rPr>
-        <w:t>Coalition for Content Provenance and Authenticity. (n.d.). Content credentials technical specification. https://spec.c2pa.org/specifications/</w:t>
+        <w:t xml:space="preserve">Coalition for Content Provenance and Authenticity. (n.d.). </w:t>
+      </w:r>
+      <w:r>
+        <w:rPr>
+          <w:i/>
+        </w:rPr>
+        <w:t>Content credentials technical specification (Version 2.5)</w:t>
+      </w:r>
+      <w:r>
+        <w:rPr>
+          <w:i w:val="0"/>
+        </w:rPr>
+        <w:t>. https://spec.c2pa.org/specifications/specifications/2.5/index.html</w:t>
       </w:r>
     </w:p>
     <w:p>
       <w:pPr>
-        <w:spacing w:line="480" w:lineRule="auto" w:after="140" w:before="0"/>
+        <w:spacing w:line="480" w:lineRule="auto" w:before="0" w:after="0"/>
         <w:ind w:left="720" w:hanging="720"/>
       </w:pPr>
       <w:r>
         <w:rPr>
-          <w:b w:val="0"/>
           <w:i w:val="0"/>
         </w:rPr>
-        <w:t>Haber, S., &amp; Stornetta, W. S. (1991). How to time-stamp a digital document. Journal of Cryptology, 3, 99–111. https://doi.org/10.1007/BF00196791</w:t>
+        <w:t xml:space="preserve">Haber, S., &amp; Stornetta, W. S. (1991). How to time-stamp a digital document. </w:t>
+      </w:r>
+      <w:r>
+        <w:rPr>
+          <w:i/>
+        </w:rPr>
+        <w:t>Journal of Cryptology, 3</w:t>
+      </w:r>
+      <w:r>
+        <w:rPr>
+          <w:i w:val="0"/>
+        </w:rPr>
+        <w:t>, 99–111. https://doi.org/10.1007/BF00196791</w:t>
       </w:r>
     </w:p>
     <w:p>
       <w:pPr>
-        <w:spacing w:line="480" w:lineRule="auto" w:after="140" w:before="0"/>
+        <w:spacing w:line="480" w:lineRule="auto" w:before="0" w:after="0"/>
         <w:ind w:left="720" w:hanging="720"/>
       </w:pPr>
       <w:r>
         <w:rPr>
-          <w:b w:val="0"/>
           <w:i w:val="0"/>
         </w:rPr>
-        <w:t>Hevner, A. R., March, S. T., Park, J., &amp; Ram, S. (2004). Design science in information systems research. MIS Quarterly, 28(1), 75–105. https://doi.org/10.2307/25148625</w:t>
+        <w:t xml:space="preserve">Hevner, A. R., March, S. T., Park, J., &amp; Ram, S. (2004). Design science in information systems research. </w:t>
+      </w:r>
+      <w:r>
+        <w:rPr>
+          <w:i/>
+        </w:rPr>
+        <w:t>MIS Quarterly, 28</w:t>
+      </w:r>
+      <w:r>
+        <w:rPr>
+          <w:i w:val="0"/>
+        </w:rPr>
+        <w:t>(1), 75–105. https://doi.org/10.2307/25148625</w:t>
       </w:r>
     </w:p>
     <w:p>
       <w:pPr>
-        <w:spacing w:line="480" w:lineRule="auto" w:after="140" w:before="0"/>
+        <w:spacing w:line="480" w:lineRule="auto" w:before="0" w:after="0"/>
         <w:ind w:left="720" w:hanging="720"/>
       </w:pPr>
       <w:r>
         <w:rPr>
-          <w:b w:val="0"/>
           <w:i w:val="0"/>
         </w:rPr>
-        <w:t>IEEE Access. (n.d.). Preparing your article. https://ieeeaccess.ieee.org/authors/preparing-your-article/</w:t>
+        <w:t xml:space="preserve">IEEE Access. (n.d.). </w:t>
+      </w:r>
+      <w:r>
+        <w:rPr>
+          <w:i/>
+        </w:rPr>
+        <w:t>Preparing your article</w:t>
+      </w:r>
+      <w:r>
+        <w:rPr>
+          <w:i w:val="0"/>
+        </w:rPr>
+        <w:t>. https://ieeeaccess.ieee.org/authors/preparing-your-article/</w:t>
       </w:r>
     </w:p>
     <w:p>
       <w:pPr>
-        <w:spacing w:line="480" w:lineRule="auto" w:after="140" w:before="0"/>
+        <w:spacing w:line="480" w:lineRule="auto" w:before="0" w:after="0"/>
         <w:ind w:left="720" w:hanging="720"/>
       </w:pPr>
       <w:r>
         <w:rPr>
-          <w:b w:val="0"/>
           <w:i w:val="0"/>
         </w:rPr>
-        <w:t>National Institute of Standards and Technology. (2015). Secure hash standard (FIPS PUB 180-4). U.S. Department of Commerce. https://doi.org/10.6028/NIST.FIPS.180-4</w:t>
+        <w:t xml:space="preserve">National Institute of Standards and Technology. (2015). </w:t>
+      </w:r>
+      <w:r>
+        <w:rPr>
+          <w:i/>
+        </w:rPr>
+        <w:t>Secure hash standard (FIPS PUB 180-4)</w:t>
+      </w:r>
+      <w:r>
+        <w:rPr>
+          <w:i w:val="0"/>
+        </w:rPr>
+        <w:t>. U.S. Department of Commerce. https://doi.org/10.6028/NIST.FIPS.180-4</w:t>
       </w:r>
     </w:p>
     <w:p>
       <w:pPr>
-        <w:spacing w:line="480" w:lineRule="auto" w:after="140" w:before="0"/>
+        <w:spacing w:line="480" w:lineRule="auto" w:before="0" w:after="0"/>
         <w:ind w:left="720" w:hanging="720"/>
       </w:pPr>
       <w:r>
         <w:rPr>
-          <w:b w:val="0"/>
           <w:i w:val="0"/>
         </w:rPr>
-        <w:t>National Institute of Standards and Technology. (2022a). Assessing security and privacy controls in information systems and organizations (NIST SP 800-53A Rev. 5). U.S. Department of Commerce. https://doi.org/10.6028/NIST.SP.800-53Ar5</w:t>
+        <w:t xml:space="preserve">National Institute of Standards and Technology. (2022a). </w:t>
+      </w:r>
+      <w:r>
+        <w:rPr>
+          <w:i/>
+        </w:rPr>
+        <w:t>Assessing security and privacy controls in information systems and organizations (NIST SP 800-53A Rev. 5)</w:t>
+      </w:r>
+      <w:r>
+        <w:rPr>
+          <w:i w:val="0"/>
+        </w:rPr>
+        <w:t>. U.S. Department of Commerce. https://doi.org/10.6028/NIST.SP.800-53Ar5</w:t>
       </w:r>
     </w:p>
     <w:p>
       <w:pPr>
-        <w:spacing w:line="480" w:lineRule="auto" w:after="140" w:before="0"/>
+        <w:spacing w:line="480" w:lineRule="auto" w:before="0" w:after="0"/>
         <w:ind w:left="720" w:hanging="720"/>
       </w:pPr>
       <w:r>
         <w:rPr>
-          <w:b w:val="0"/>
           <w:i w:val="0"/>
         </w:rPr>
-        <w:t>National Institute of Standards and Technology. (2022b). Secure software development framework (SSDF) version 1.1 (NIST SP 800-218). U.S. Department of Commerce. https://doi.org/10.6028/NIST.SP.800-218</w:t>
+        <w:t xml:space="preserve">National Institute of Standards and Technology. (2022b). </w:t>
+      </w:r>
+      <w:r>
+        <w:rPr>
+          <w:i/>
+        </w:rPr>
+        <w:t>Secure software development framework (SSDF) version 1.1 (NIST SP 800-218)</w:t>
+      </w:r>
+      <w:r>
+        <w:rPr>
+          <w:i w:val="0"/>
+        </w:rPr>
+        <w:t>. U.S. Department of Commerce. https://doi.org/10.6028/NIST.SP.800-218</w:t>
       </w:r>
     </w:p>
     <w:p>
       <w:pPr>
-        <w:spacing w:line="480" w:lineRule="auto" w:after="140" w:before="0"/>
+        <w:spacing w:line="480" w:lineRule="auto" w:before="0" w:after="0"/>
         <w:ind w:left="720" w:hanging="720"/>
       </w:pPr>
       <w:r>
         <w:rPr>
-          <w:b w:val="0"/>
           <w:i w:val="0"/>
         </w:rPr>
-        <w:t>OpenAI. (2026a). ChatGPT [Large language model]. https://chatgpt.com/</w:t>
+        <w:t xml:space="preserve">OpenAI. (2026a). </w:t>
+      </w:r>
+      <w:r>
+        <w:rPr>
+          <w:i/>
+        </w:rPr>
+        <w:t>ChatGPT</w:t>
+      </w:r>
+      <w:r>
+        <w:rPr>
+          <w:i w:val="0"/>
+        </w:rPr>
+        <w:t xml:space="preserve"> [Large language model]. https://chatgpt.com/</w:t>
       </w:r>
     </w:p>
     <w:p>
       <w:pPr>
-        <w:spacing w:line="480" w:lineRule="auto" w:after="140" w:before="0"/>
+        <w:spacing w:line="480" w:lineRule="auto" w:before="0" w:after="0"/>
         <w:ind w:left="720" w:hanging="720"/>
       </w:pPr>
       <w:r>
         <w:rPr>
-          <w:b w:val="0"/>
           <w:i w:val="0"/>
         </w:rPr>
-        <w:t>OpenAI. (2026b). Codex [AI coding agent]. https://openai.com/codex/</w:t>
+        <w:t xml:space="preserve">OpenAI. (2026b). </w:t>
+      </w:r>
+      <w:r>
+        <w:rPr>
+          <w:i/>
+        </w:rPr>
+        <w:t>Codex</w:t>
+      </w:r>
+      <w:r>
+        <w:rPr>
+          <w:i w:val="0"/>
+        </w:rPr>
+        <w:t xml:space="preserve"> [AI coding agent]. https://openai.com/codex/</w:t>
       </w:r>
     </w:p>
     <w:p>
       <w:pPr>
-        <w:spacing w:line="480" w:lineRule="auto" w:after="140" w:before="0"/>
+        <w:spacing w:line="480" w:lineRule="auto" w:before="0" w:after="0"/>
         <w:ind w:left="720" w:hanging="720"/>
       </w:pPr>
       <w:r>
         <w:rPr>
-          <w:b w:val="0"/>
           <w:i w:val="0"/>
         </w:rPr>
-        <w:t>OpenZeppelin. (n.d.). OpenZeppelin contracts documentation. https://docs.openzeppelin.com/contracts/</w:t>
+        <w:t xml:space="preserve">OpenZeppelin. (n.d.). </w:t>
+      </w:r>
+      <w:r>
+        <w:rPr>
+          <w:i/>
+        </w:rPr>
+        <w:t>OpenZeppelin contracts documentation</w:t>
+      </w:r>
+      <w:r>
+        <w:rPr>
+          <w:i w:val="0"/>
+        </w:rPr>
+        <w:t>. https://docs.openzeppelin.com/contracts/</w:t>
       </w:r>
     </w:p>
     <w:p>
       <w:pPr>
-        <w:spacing w:line="480" w:lineRule="auto" w:after="140" w:before="0"/>
+        <w:spacing w:line="480" w:lineRule="auto" w:before="0" w:after="0"/>
         <w:ind w:left="720" w:hanging="720"/>
       </w:pPr>
       <w:r>
         <w:rPr>
-          <w:b w:val="0"/>
           <w:i w:val="0"/>
         </w:rPr>
-        <w:t>Rundgren, A., Jordan, B., &amp; Erdtman, S. (2020). JSON canonicalization scheme (JCS) (RFC 8785). Internet Engineering Task Force. https://doi.org/10.17487/RFC8785</w:t>
+        <w:t xml:space="preserve">Rundgren, A., Jordan, B., &amp; Erdtman, S. (2020). </w:t>
+      </w:r>
+      <w:r>
+        <w:rPr>
+          <w:i/>
+        </w:rPr>
+        <w:t>JSON canonicalization scheme (JCS) (RFC 8785)</w:t>
+      </w:r>
+      <w:r>
+        <w:rPr>
+          <w:i w:val="0"/>
+        </w:rPr>
+        <w:t>. Internet Engineering Task Force. https://doi.org/10.17487/RFC8785</w:t>
       </w:r>
     </w:p>
     <w:p>
       <w:pPr>
-        <w:spacing w:line="480" w:lineRule="auto" w:after="140" w:before="0"/>
+        <w:spacing w:line="480" w:lineRule="auto" w:before="0" w:after="0"/>
         <w:ind w:left="720" w:hanging="720"/>
       </w:pPr>
       <w:r>
         <w:rPr>
-          <w:b w:val="0"/>
           <w:i w:val="0"/>
         </w:rPr>
-        <w:t>Supply-chain Levels for Software Artifacts. (n.d.). SLSA specification version 1.2. https://slsa.dev/spec/v1.2/</w:t>
+        <w:t xml:space="preserve">Supply-chain Levels for Software Artifacts. (n.d.). </w:t>
+      </w:r>
+      <w:r>
+        <w:rPr>
+          <w:i/>
+        </w:rPr>
+        <w:t>SLSA specification version 1.2</w:t>
+      </w:r>
+      <w:r>
+        <w:rPr>
+          <w:i w:val="0"/>
+        </w:rPr>
+        <w:t>. https://slsa.dev/spec/v1.2/</w:t>
       </w:r>
     </w:p>
     <w:p>
       <w:pPr>
-        <w:spacing w:line="480" w:lineRule="auto" w:after="140" w:before="0"/>
+        <w:spacing w:line="480" w:lineRule="auto" w:before="0" w:after="0"/>
         <w:ind w:left="720" w:hanging="720"/>
       </w:pPr>
       <w:r>
         <w:rPr>
-          <w:b w:val="0"/>
           <w:i w:val="0"/>
         </w:rPr>
-        <w:t>Torres-Arias, S., Afzali, H., Kuppusamy, T. K., Curtmola, R., &amp; Cappos, J. (2019). in-toto: Providing farm-to-table guarantees for bits and bytes. In 28th USENIX Security Symposium (USENIX Security 19) (pp. 1393–1410). USENIX Association. https://www.usenix.org/conference/usenixsecurity19/presentation/torres-arias</w:t>
+        <w:t xml:space="preserve">Torres-Arias, S., Afzali, H., Kuppusamy, T. K., Curtmola, R., &amp; Cappos, J. (2019). in-toto: Providing farm-to-table guarantees for bits and bytes. In </w:t>
+      </w:r>
+      <w:r>
+        <w:rPr>
+          <w:i/>
+        </w:rPr>
+        <w:t>28th USENIX Security Symposium (USENIX Security 19)</w:t>
+      </w:r>
+      <w:r>
+        <w:rPr>
+          <w:i w:val="0"/>
+        </w:rPr>
+        <w:t xml:space="preserve"> (pp. 1393–1410). USENIX Association. https://www.usenix.org/conference/usenixsecurity19/presentation/torres-arias</w:t>
       </w:r>
     </w:p>
     <w:p>
       <w:pPr>
-        <w:spacing w:line="480" w:lineRule="auto" w:after="140" w:before="0"/>
+        <w:spacing w:line="480" w:lineRule="auto" w:before="0" w:after="0"/>
         <w:ind w:left="720" w:hanging="720"/>
       </w:pPr>
       <w:r>
         <w:rPr>
-          <w:b w:val="0"/>
           <w:i w:val="0"/>
         </w:rPr>
-        <w:t>World Wide Web Consortium. (2025). Verifiable credentials data model v2.0. https://www.w3.org/TR/vc-data-model-2.0/</w:t>
+        <w:t xml:space="preserve">World Wide Web Consortium. (2025). </w:t>
+      </w:r>
+      <w:r>
+        <w:rPr>
+          <w:i/>
+        </w:rPr>
+        <w:t>Verifiable credentials data model v2.0</w:t>
+      </w:r>
+      <w:r>
+        <w:rPr>
+          <w:i w:val="0"/>
+        </w:rPr>
+        <w:t>. https://www.w3.org/TR/vc-data-model-2.0/</w:t>
       </w:r>
     </w:p>
     <w:sectPr>
@@ -6047,6 +6143,9 @@
     <w:name w:val="Normal"/>
     <w:qFormat/>
     <w:rsid w:val="00FC693F"/>
+    <w:pPr>
+      <w:spacing w:line="480" w:lineRule="auto" w:before="0" w:after="0"/>
+    </w:pPr>
     <w:rPr>
       <w:rFonts w:ascii="Times New Roman" w:hAnsi="Times New Roman" w:eastAsia="Times New Roman"/>
       <w:sz w:val="24"/>

</xml_diff>